<commit_message>
Update Hotness Assist docs and help modal; add User Guide download link (v0.4.93)
- USER_GUIDE.md section 9 rewritten to match current UI: W1/W2/B1/B2 markers,
  Pattern Analysis + Spike Behavior, What's Different (W1 vs B1), Common Bad Signals
  (W1 vs W2), Common Good Signals (B1 vs B2), Advanced Signals, Davis Problems at bottom
- Updated Hotness Assist workflow and Incident Response Workflow step references
- HelpModal.tsx: Hotness Assist section updated to match current section order and names
- HelpModal.tsx: added User Guide download button in header (downloads docx from GitHub)
- Regenerated USER_GUIDE.docx

Co-Authored-By: Claude Sonnet 4.6 <noreply@anthropic.com>
</commit_message>
<xml_diff>
--- a/USER_GUIDE.docx
+++ b/USER_GUIDE.docx
@@ -3377,15 +3377,167 @@
           <w:b/>
           <w:bCs/>
         </w:rPr>
+        <w:t xml:space="preserve">Hotness Assist Analysis</w:t>
+      </w:r>
+      <w:r>
+        <w:t xml:space="preserve"> </w:t>
+      </w:r>
+      <w:r>
+        <w:t xml:space="preserve">— animated narrative that describes what happened and when, rendered word-by-word. The first paragraph is a data summary; the second is a root-cause narrative identifying leading indicators and cascade sequences.</w:t>
+      </w:r>
+    </w:p>
+    <w:p>
+      <w:pPr>
+        <w:pStyle w:val="BodyText"/>
+      </w:pPr>
+      <w:r>
+        <w:rPr>
+          <w:b/>
+          <w:bCs/>
+        </w:rPr>
         <w:t xml:space="preserve">Hotness Timeline</w:t>
       </w:r>
       <w:r>
         <w:t xml:space="preserve"> </w:t>
       </w:r>
       <w:r>
-        <w:t xml:space="preserve">— mini sparkline of the Z-score across the full window, with worst and best bucket markers (▼ / ▲).</w:t>
-      </w:r>
-    </w:p>
+        <w:t xml:space="preserve">— mini sparkline of the Z-score across the full window. Four bucket markers are labeled directly on the chart:</w:t>
+      </w:r>
+    </w:p>
+    <w:tbl>
+      <w:tblPr>
+        <w:tblStyle w:val="Table"/>
+        <w:tblW w:type="auto" w:w="0"/>
+        <w:tblLook w:firstRow="1" w:lastRow="0" w:firstColumn="0" w:lastColumn="0" w:noHBand="0" w:noVBand="0" w:val="0020"/>
+      </w:tblPr>
+      <w:tblGrid>
+        <w:gridCol w:w="3960"/>
+        <w:gridCol w:w="3960"/>
+      </w:tblGrid>
+      <w:tr>
+        <w:trPr>
+          <w:tblHeader w:val="on"/>
+        </w:trPr>
+        <w:tc>
+          <w:tcPr/>
+          <w:p>
+            <w:pPr>
+              <w:pStyle w:val="Compact"/>
+            </w:pPr>
+            <w:r>
+              <w:t xml:space="preserve">Marker</w:t>
+            </w:r>
+          </w:p>
+        </w:tc>
+        <w:tc>
+          <w:tcPr/>
+          <w:p>
+            <w:pPr>
+              <w:pStyle w:val="Compact"/>
+            </w:pPr>
+            <w:r>
+              <w:t xml:space="preserve">Meaning</w:t>
+            </w:r>
+          </w:p>
+        </w:tc>
+      </w:tr>
+      <w:tr>
+        <w:tc>
+          <w:tcPr/>
+          <w:p>
+            <w:pPr>
+              <w:pStyle w:val="Compact"/>
+            </w:pPr>
+            <w:r>
+              <w:t xml:space="preserve">W1 (red)</w:t>
+            </w:r>
+          </w:p>
+        </w:tc>
+        <w:tc>
+          <w:tcPr/>
+          <w:p>
+            <w:pPr>
+              <w:pStyle w:val="Compact"/>
+            </w:pPr>
+            <w:r>
+              <w:t xml:space="preserve">Worst bucket — peak degradation</w:t>
+            </w:r>
+          </w:p>
+        </w:tc>
+      </w:tr>
+      <w:tr>
+        <w:tc>
+          <w:tcPr/>
+          <w:p>
+            <w:pPr>
+              <w:pStyle w:val="Compact"/>
+            </w:pPr>
+            <w:r>
+              <w:t xml:space="preserve">W2 (pink)</w:t>
+            </w:r>
+          </w:p>
+        </w:tc>
+        <w:tc>
+          <w:tcPr/>
+          <w:p>
+            <w:pPr>
+              <w:pStyle w:val="Compact"/>
+            </w:pPr>
+            <w:r>
+              <w:t xml:space="preserve">2nd worst bucket — secondary peak</w:t>
+            </w:r>
+          </w:p>
+        </w:tc>
+      </w:tr>
+      <w:tr>
+        <w:tc>
+          <w:tcPr/>
+          <w:p>
+            <w:pPr>
+              <w:pStyle w:val="Compact"/>
+            </w:pPr>
+            <w:r>
+              <w:t xml:space="preserve">B1 (green)</w:t>
+            </w:r>
+          </w:p>
+        </w:tc>
+        <w:tc>
+          <w:tcPr/>
+          <w:p>
+            <w:pPr>
+              <w:pStyle w:val="Compact"/>
+            </w:pPr>
+            <w:r>
+              <w:t xml:space="preserve">Best bucket — optimal conditions</w:t>
+            </w:r>
+          </w:p>
+        </w:tc>
+      </w:tr>
+      <w:tr>
+        <w:tc>
+          <w:tcPr/>
+          <w:p>
+            <w:pPr>
+              <w:pStyle w:val="Compact"/>
+            </w:pPr>
+            <w:r>
+              <w:t xml:space="preserve">B2 (light green)</w:t>
+            </w:r>
+          </w:p>
+        </w:tc>
+        <w:tc>
+          <w:tcPr/>
+          <w:p>
+            <w:pPr>
+              <w:pStyle w:val="Compact"/>
+            </w:pPr>
+            <w:r>
+              <w:t xml:space="preserve">2nd best bucket — secondary baseline</w:t>
+            </w:r>
+          </w:p>
+        </w:tc>
+      </w:tr>
+    </w:tbl>
     <w:p>
       <w:pPr>
         <w:pStyle w:val="BodyText"/>
@@ -3395,7 +3547,7 @@
           <w:b/>
           <w:bCs/>
         </w:rPr>
-        <w:t xml:space="preserve">Activity Pattern</w:t>
+        <w:t xml:space="preserve">Pattern Analysis</w:t>
       </w:r>
       <w:r>
         <w:t xml:space="preserve"> </w:t>
@@ -3501,31 +3653,13 @@
           <w:b/>
           <w:bCs/>
         </w:rPr>
-        <w:t xml:space="preserve">Worst vs Best Buckets</w:t>
-      </w:r>
-      <w:r>
-        <w:t xml:space="preserve"> </w:t>
-      </w:r>
-      <w:r>
-        <w:t xml:space="preserve">— side-by-side metric breakdown comparing the single hottest and coolest time buckets. This isolates exactly which metrics were elevated at peak degradation.</w:t>
-      </w:r>
-    </w:p>
-    <w:p>
-      <w:pPr>
-        <w:pStyle w:val="BodyText"/>
-      </w:pPr>
-      <w:r>
-        <w:rPr>
-          <w:b/>
-          <w:bCs/>
-        </w:rPr>
-        <w:t xml:space="preserve">Gap Table</w:t>
-      </w:r>
-      <w:r>
-        <w:t xml:space="preserve"> </w:t>
-      </w:r>
-      <w:r>
-        <w:t xml:space="preserve">— for each metric, how much it improved from the worst bucket to the best bucket. Large gaps indicate high-impact metrics worth focusing on.</w:t>
+        <w:t xml:space="preserve">Spike Behavior</w:t>
+      </w:r>
+      <w:r>
+        <w:t xml:space="preserve"> </w:t>
+      </w:r>
+      <w:r>
+        <w:t xml:space="preserve">— episode count, longest consecutive spike run, and average recovery interval between episodes.</w:t>
       </w:r>
     </w:p>
     <w:p>
@@ -3690,7 +3824,129 @@
           <w:b/>
           <w:bCs/>
         </w:rPr>
-        <w:t xml:space="preserve">Insights &amp; Recommendations</w:t>
+        <w:t xml:space="preserve">What’s Different — Worst #1 vs Best #1</w:t>
+      </w:r>
+      <w:r>
+        <w:t xml:space="preserve"> </w:t>
+      </w:r>
+      <w:r>
+        <w:t xml:space="preserve">— side-by-side metric breakdown comparing W1 (peak degradation) against B1 (optimal conditions), followed by a</w:t>
+      </w:r>
+      <w:r>
+        <w:t xml:space="preserve"> </w:t>
+      </w:r>
+      <w:r>
+        <w:rPr>
+          <w:b/>
+          <w:bCs/>
+        </w:rPr>
+        <w:t xml:space="preserve">Gap Table</w:t>
+      </w:r>
+      <w:r>
+        <w:t xml:space="preserve"> </w:t>
+      </w:r>
+      <w:r>
+        <w:t xml:space="preserve">showing how much each metric improved between those two buckets. Large gaps indicate high-impact metrics worth investigating.</w:t>
+      </w:r>
+    </w:p>
+    <w:p>
+      <w:pPr>
+        <w:pStyle w:val="BodyText"/>
+      </w:pPr>
+      <w:r>
+        <w:rPr>
+          <w:b/>
+          <w:bCs/>
+        </w:rPr>
+        <w:t xml:space="preserve">Common Bad Signals — Worst #1 vs Worst #2</w:t>
+      </w:r>
+      <w:r>
+        <w:t xml:space="preserve"> </w:t>
+      </w:r>
+      <w:r>
+        <w:rPr>
+          <w:i/>
+          <w:iCs/>
+        </w:rPr>
+        <w:t xml:space="preserve">(shown when two distinct worst buckets exist)</w:t>
+      </w:r>
+      <w:r>
+        <w:t xml:space="preserve"> </w:t>
+      </w:r>
+      <w:r>
+        <w:t xml:space="preserve">— compares W1 and W2 side-by-side and highlights metrics elevated in</w:t>
+      </w:r>
+      <w:r>
+        <w:t xml:space="preserve"> </w:t>
+      </w:r>
+      <w:r>
+        <w:rPr>
+          <w:i/>
+          <w:iCs/>
+        </w:rPr>
+        <w:t xml:space="preserve">both</w:t>
+      </w:r>
+      <w:r>
+        <w:t xml:space="preserve"> </w:t>
+      </w:r>
+      <w:r>
+        <w:t xml:space="preserve">worst windows. Signals persistent across multiple bad periods are your most reliable problem indicators.</w:t>
+      </w:r>
+    </w:p>
+    <w:p>
+      <w:pPr>
+        <w:pStyle w:val="BodyText"/>
+      </w:pPr>
+      <w:r>
+        <w:rPr>
+          <w:b/>
+          <w:bCs/>
+        </w:rPr>
+        <w:t xml:space="preserve">Common Good Signals — Best #1 vs Best #2</w:t>
+      </w:r>
+      <w:r>
+        <w:t xml:space="preserve"> </w:t>
+      </w:r>
+      <w:r>
+        <w:rPr>
+          <w:i/>
+          <w:iCs/>
+        </w:rPr>
+        <w:t xml:space="preserve">(shown when two distinct best buckets exist)</w:t>
+      </w:r>
+      <w:r>
+        <w:t xml:space="preserve"> </w:t>
+      </w:r>
+      <w:r>
+        <w:t xml:space="preserve">— compares B1 and B2 and highlights metrics healthy in</w:t>
+      </w:r>
+      <w:r>
+        <w:t xml:space="preserve"> </w:t>
+      </w:r>
+      <w:r>
+        <w:rPr>
+          <w:i/>
+          <w:iCs/>
+        </w:rPr>
+        <w:t xml:space="preserve">both</w:t>
+      </w:r>
+      <w:r>
+        <w:t xml:space="preserve"> </w:t>
+      </w:r>
+      <w:r>
+        <w:t xml:space="preserve">best windows. These represent your true baseline operating conditions and are the most defensible SLO reference points.</w:t>
+      </w:r>
+    </w:p>
+    <w:p>
+      <w:pPr>
+        <w:pStyle w:val="BodyText"/>
+      </w:pPr>
+      <w:r>
+        <w:rPr>
+          <w:b/>
+          <w:bCs/>
+        </w:rPr>
+        <w:t xml:space="preserve">Insights</w:t>
       </w:r>
       <w:r>
         <w:t xml:space="preserve"> </w:t>
@@ -3708,13 +3964,13 @@
           <w:b/>
           <w:bCs/>
         </w:rPr>
-        <w:t xml:space="preserve">Davis Problems</w:t>
-      </w:r>
-      <w:r>
-        <w:t xml:space="preserve"> </w:t>
-      </w:r>
-      <w:r>
-        <w:t xml:space="preserve">— any active Davis Problems during the timeframe, with their names listed.</w:t>
+        <w:t xml:space="preserve">Recommendations</w:t>
+      </w:r>
+      <w:r>
+        <w:t xml:space="preserve"> </w:t>
+      </w:r>
+      <w:r>
+        <w:t xml:space="preserve">— prioritized actions based on what the data found.</w:t>
       </w:r>
     </w:p>
     <w:p>
@@ -3726,13 +3982,135 @@
           <w:b/>
           <w:bCs/>
         </w:rPr>
+        <w:t xml:space="preserve">Advanced Signals</w:t>
+      </w:r>
+      <w:r>
+        <w:t xml:space="preserve"> </w:t>
+      </w:r>
+      <w:r>
+        <w:rPr>
+          <w:i/>
+          <w:iCs/>
+        </w:rPr>
+        <w:t xml:space="preserve">(shown when detected)</w:t>
+      </w:r>
+      <w:r>
+        <w:t xml:space="preserve"> </w:t>
+      </w:r>
+      <w:r>
+        <w:t xml:space="preserve">— deeper signals including:</w:t>
+      </w:r>
+      <w:r>
+        <w:t xml:space="preserve"> </w:t>
+      </w:r>
+      <w:r>
+        <w:t xml:space="preserve">-</w:t>
+      </w:r>
+      <w:r>
+        <w:t xml:space="preserve"> </w:t>
+      </w:r>
+      <w:r>
+        <w:rPr>
+          <w:i/>
+          <w:iCs/>
+        </w:rPr>
+        <w:t xml:space="preserve">SLO Breach</w:t>
+      </w:r>
+      <w:r>
+        <w:t xml:space="preserve"> </w:t>
+      </w:r>
+      <w:r>
+        <w:t xml:space="preserve">— estimated minutes of critical-level degradation in the session</w:t>
+      </w:r>
+      <w:r>
+        <w:t xml:space="preserve"> </w:t>
+      </w:r>
+      <w:r>
+        <w:t xml:space="preserve">-</w:t>
+      </w:r>
+      <w:r>
+        <w:t xml:space="preserve"> </w:t>
+      </w:r>
+      <w:r>
+        <w:rPr>
+          <w:i/>
+          <w:iCs/>
+        </w:rPr>
+        <w:t xml:space="preserve">Cascade</w:t>
+      </w:r>
+      <w:r>
+        <w:t xml:space="preserve"> </w:t>
+      </w:r>
+      <w:r>
+        <w:t xml:space="preserve">— which metric fired first and which followed, in sequence across buckets</w:t>
+      </w:r>
+      <w:r>
+        <w:t xml:space="preserve"> </w:t>
+      </w:r>
+      <w:r>
+        <w:t xml:space="preserve">-</w:t>
+      </w:r>
+      <w:r>
+        <w:t xml:space="preserve"> </w:t>
+      </w:r>
+      <w:r>
+        <w:rPr>
+          <w:i/>
+          <w:iCs/>
+        </w:rPr>
+        <w:t xml:space="preserve">Efficiency</w:t>
+      </w:r>
+      <w:r>
+        <w:t xml:space="preserve"> </w:t>
+      </w:r>
+      <w:r>
+        <w:t xml:space="preserve">— traffic vs performance relationship anomalies</w:t>
+      </w:r>
+    </w:p>
+    <w:p>
+      <w:pPr>
+        <w:pStyle w:val="BodyText"/>
+      </w:pPr>
+      <w:r>
+        <w:rPr>
+          <w:b/>
+          <w:bCs/>
+        </w:rPr>
         <w:t xml:space="preserve">Next Steps</w:t>
       </w:r>
       <w:r>
         <w:t xml:space="preserve"> </w:t>
       </w:r>
       <w:r>
-        <w:t xml:space="preserve">— a list of Investigate buttons for every metric that exceeded its threshold, linking directly into the relevant Dynatrace app.</w:t>
+        <w:t xml:space="preserve">— Investigate buttons for every metric that exceeded its threshold, linking directly into the relevant Dynatrace app.</w:t>
+      </w:r>
+    </w:p>
+    <w:p>
+      <w:pPr>
+        <w:pStyle w:val="BodyText"/>
+      </w:pPr>
+      <w:r>
+        <w:rPr>
+          <w:b/>
+          <w:bCs/>
+        </w:rPr>
+        <w:t xml:space="preserve">Active Davis Problems</w:t>
+      </w:r>
+      <w:r>
+        <w:t xml:space="preserve"> </w:t>
+      </w:r>
+      <w:r>
+        <w:rPr>
+          <w:i/>
+          <w:iCs/>
+        </w:rPr>
+        <w:t xml:space="preserve">(shown when present)</w:t>
+      </w:r>
+      <w:r>
+        <w:t xml:space="preserve"> </w:t>
+      </w:r>
+      <w:r>
+        <w:t xml:space="preserve">— Davis Problems open during the timeframe, listed at the bottom as contextual reference.</w:t>
       </w:r>
     </w:p>
     <w:p>
@@ -6822,17 +7200,17 @@
         </w:numPr>
       </w:pPr>
       <w:r>
-        <w:t xml:space="preserve">Check the</w:t>
-      </w:r>
-      <w:r>
-        <w:t xml:space="preserve"> </w:t>
-      </w:r>
-      <w:r>
-        <w:rPr>
-          <w:b/>
-          <w:bCs/>
-        </w:rPr>
-        <w:t xml:space="preserve">Activity Pattern</w:t>
+        <w:t xml:space="preserve">Check</w:t>
+      </w:r>
+      <w:r>
+        <w:t xml:space="preserve"> </w:t>
+      </w:r>
+      <w:r>
+        <w:rPr>
+          <w:b/>
+          <w:bCs/>
+        </w:rPr>
+        <w:t xml:space="preserve">Pattern Analysis</w:t>
       </w:r>
       <w:r>
         <w:t xml:space="preserve"> </w:t>
@@ -6860,13 +7238,13 @@
           <w:b/>
           <w:bCs/>
         </w:rPr>
-        <w:t xml:space="preserve">Worst vs Best Buckets</w:t>
-      </w:r>
-      <w:r>
-        <w:t xml:space="preserve"> </w:t>
-      </w:r>
-      <w:r>
-        <w:t xml:space="preserve">to identify which metrics were worst at peak.</w:t>
+        <w:t xml:space="preserve">What’s Different — W1 vs B1</w:t>
+      </w:r>
+      <w:r>
+        <w:t xml:space="preserve"> </w:t>
+      </w:r>
+      <w:r>
+        <w:t xml:space="preserve">to see which metrics were worst at peak.</w:t>
       </w:r>
     </w:p>
     <w:p>
@@ -6878,23 +7256,23 @@
         </w:numPr>
       </w:pPr>
       <w:r>
-        <w:t xml:space="preserve">Use the</w:t>
-      </w:r>
-      <w:r>
-        <w:t xml:space="preserve"> </w:t>
-      </w:r>
-      <w:r>
-        <w:rPr>
-          <w:b/>
-          <w:bCs/>
-        </w:rPr>
-        <w:t xml:space="preserve">Cross-Metric Correlation</w:t>
-      </w:r>
-      <w:r>
-        <w:t xml:space="preserve"> </w:t>
-      </w:r>
-      <w:r>
-        <w:t xml:space="preserve">table to find cascading effects. If Error Rate drives Response Time (Rate = 95%), fixing errors will likely fix latency too.</w:t>
+        <w:t xml:space="preserve">If W2 exists, check</w:t>
+      </w:r>
+      <w:r>
+        <w:t xml:space="preserve"> </w:t>
+      </w:r>
+      <w:r>
+        <w:rPr>
+          <w:b/>
+          <w:bCs/>
+        </w:rPr>
+        <w:t xml:space="preserve">Common Bad Signals</w:t>
+      </w:r>
+      <w:r>
+        <w:t xml:space="preserve"> </w:t>
+      </w:r>
+      <w:r>
+        <w:t xml:space="preserve">— metrics elevated in both worst windows are your strongest leads.</w:t>
       </w:r>
     </w:p>
     <w:p>
@@ -6906,6 +7284,34 @@
         </w:numPr>
       </w:pPr>
       <w:r>
+        <w:t xml:space="preserve">Use the</w:t>
+      </w:r>
+      <w:r>
+        <w:t xml:space="preserve"> </w:t>
+      </w:r>
+      <w:r>
+        <w:rPr>
+          <w:b/>
+          <w:bCs/>
+        </w:rPr>
+        <w:t xml:space="preserve">Cross-Metric Correlation</w:t>
+      </w:r>
+      <w:r>
+        <w:t xml:space="preserve"> </w:t>
+      </w:r>
+      <w:r>
+        <w:t xml:space="preserve">table to find cascading effects. If Error Rate drives Response Time (Rate = 95%), fixing errors will likely fix latency too.</w:t>
+      </w:r>
+    </w:p>
+    <w:p>
+      <w:pPr>
+        <w:pStyle w:val="Compact"/>
+        <w:numPr>
+          <w:ilvl w:val="0"/>
+          <w:numId w:val="1017"/>
+        </w:numPr>
+      </w:pPr>
+      <w:r>
         <w:t xml:space="preserve">Use</w:t>
       </w:r>
       <w:r>
@@ -7093,7 +7499,7 @@
           <w:b/>
           <w:bCs/>
         </w:rPr>
-        <w:t xml:space="preserve">Activity Pattern</w:t>
+        <w:t xml:space="preserve">Pattern Analysis</w:t>
       </w:r>
       <w:r>
         <w:t xml:space="preserve"> </w:t>
@@ -7121,13 +7527,13 @@
           <w:b/>
           <w:bCs/>
         </w:rPr>
-        <w:t xml:space="preserve">Davis Problems</w:t>
-      </w:r>
-      <w:r>
-        <w:t xml:space="preserve"> </w:t>
-      </w:r>
-      <w:r>
-        <w:t xml:space="preserve">— is there already an open problem? If yes, coordinate with whoever owns it.</w:t>
+        <w:t xml:space="preserve">Active Davis Problems</w:t>
+      </w:r>
+      <w:r>
+        <w:t xml:space="preserve"> </w:t>
+      </w:r>
+      <w:r>
+        <w:t xml:space="preserve">at the bottom — is there already an open problem? If yes, coordinate with whoever owns it.</w:t>
       </w:r>
     </w:p>
     <w:bookmarkEnd w:id="74"/>
@@ -7159,13 +7565,41 @@
           <w:b/>
           <w:bCs/>
         </w:rPr>
-        <w:t xml:space="preserve">Worst vs Best Buckets</w:t>
+        <w:t xml:space="preserve">What’s Different — W1 vs B1</w:t>
       </w:r>
       <w:r>
         <w:t xml:space="preserve"> </w:t>
       </w:r>
       <w:r>
         <w:t xml:space="preserve">in Hotness Assist — which metrics were highest at peak?</w:t>
+      </w:r>
+    </w:p>
+    <w:p>
+      <w:pPr>
+        <w:pStyle w:val="Compact"/>
+        <w:numPr>
+          <w:ilvl w:val="0"/>
+          <w:numId w:val="1020"/>
+        </w:numPr>
+      </w:pPr>
+      <w:r>
+        <w:t xml:space="preserve">If a second worst bucket exists, check</w:t>
+      </w:r>
+      <w:r>
+        <w:t xml:space="preserve"> </w:t>
+      </w:r>
+      <w:r>
+        <w:rPr>
+          <w:b/>
+          <w:bCs/>
+        </w:rPr>
+        <w:t xml:space="preserve">Common Bad Signals (W1 vs W2)</w:t>
+      </w:r>
+      <w:r>
+        <w:t xml:space="preserve"> </w:t>
+      </w:r>
+      <w:r>
+        <w:t xml:space="preserve">— metrics elevated in both are your strongest leads.</w:t>
       </w:r>
     </w:p>
     <w:p>
@@ -8736,11 +9170,11 @@
       </w:pPr>
     </w:lvl>
   </w:abstractNum>
-  <w:abstractNum w:abstractNumId="994110">
-    <w:nsid w:val="0A994110"/>
+  <w:abstractNum w:abstractNumId="994111">
+    <w:nsid w:val="0A994111"/>
     <w:multiLevelType w:val="multilevel"/>
     <w:lvl w:ilvl="0">
-      <w:start w:val="10"/>
+      <w:start w:val="11"/>
       <w:numFmt w:val="decimal"/>
       <w:lvlText w:val="%1."/>
       <w:lvlJc w:val="left"/>
@@ -8749,7 +9183,7 @@
       </w:pPr>
     </w:lvl>
     <w:lvl w:ilvl="1">
-      <w:start w:val="10"/>
+      <w:start w:val="11"/>
       <w:numFmt w:val="decimal"/>
       <w:lvlText w:val="%2."/>
       <w:lvlJc w:val="left"/>
@@ -8758,7 +9192,7 @@
       </w:pPr>
     </w:lvl>
     <w:lvl w:ilvl="2">
-      <w:start w:val="10"/>
+      <w:start w:val="11"/>
       <w:numFmt w:val="decimal"/>
       <w:lvlText w:val="%3."/>
       <w:lvlJc w:val="left"/>
@@ -8767,7 +9201,7 @@
       </w:pPr>
     </w:lvl>
     <w:lvl w:ilvl="3">
-      <w:start w:val="10"/>
+      <w:start w:val="11"/>
       <w:numFmt w:val="decimal"/>
       <w:lvlText w:val="%4."/>
       <w:lvlJc w:val="left"/>
@@ -8776,7 +9210,7 @@
       </w:pPr>
     </w:lvl>
     <w:lvl w:ilvl="4">
-      <w:start w:val="10"/>
+      <w:start w:val="11"/>
       <w:numFmt w:val="decimal"/>
       <w:lvlText w:val="%5."/>
       <w:lvlJc w:val="left"/>
@@ -8785,7 +9219,7 @@
       </w:pPr>
     </w:lvl>
     <w:lvl w:ilvl="5">
-      <w:start w:val="10"/>
+      <w:start w:val="11"/>
       <w:numFmt w:val="decimal"/>
       <w:lvlText w:val="%6."/>
       <w:lvlJc w:val="left"/>
@@ -8794,7 +9228,7 @@
       </w:pPr>
     </w:lvl>
     <w:lvl w:ilvl="6">
-      <w:start w:val="10"/>
+      <w:start w:val="11"/>
       <w:numFmt w:val="decimal"/>
       <w:lvlText w:val="%7."/>
       <w:lvlJc w:val="left"/>
@@ -8803,7 +9237,7 @@
       </w:pPr>
     </w:lvl>
     <w:lvl w:ilvl="7">
-      <w:start w:val="10"/>
+      <w:start w:val="11"/>
       <w:numFmt w:val="decimal"/>
       <w:lvlText w:val="%8."/>
       <w:lvlJc w:val="left"/>
@@ -8812,7 +9246,7 @@
       </w:pPr>
     </w:lvl>
     <w:lvl w:ilvl="8">
-      <w:start w:val="10"/>
+      <w:start w:val="11"/>
       <w:numFmt w:val="decimal"/>
       <w:lvlText w:val="%9."/>
       <w:lvlJc w:val="left"/>
@@ -8821,11 +9255,11 @@
       </w:pPr>
     </w:lvl>
   </w:abstractNum>
-  <w:abstractNum w:abstractNumId="994114">
-    <w:nsid w:val="0A994114"/>
+  <w:abstractNum w:abstractNumId="994115">
+    <w:nsid w:val="0A994115"/>
     <w:multiLevelType w:val="multilevel"/>
     <w:lvl w:ilvl="0">
-      <w:start w:val="14"/>
+      <w:start w:val="15"/>
       <w:numFmt w:val="decimal"/>
       <w:lvlText w:val="%1."/>
       <w:lvlJc w:val="left"/>
@@ -8834,7 +9268,7 @@
       </w:pPr>
     </w:lvl>
     <w:lvl w:ilvl="1">
-      <w:start w:val="14"/>
+      <w:start w:val="15"/>
       <w:numFmt w:val="decimal"/>
       <w:lvlText w:val="%2."/>
       <w:lvlJc w:val="left"/>
@@ -8843,7 +9277,7 @@
       </w:pPr>
     </w:lvl>
     <w:lvl w:ilvl="2">
-      <w:start w:val="14"/>
+      <w:start w:val="15"/>
       <w:numFmt w:val="decimal"/>
       <w:lvlText w:val="%3."/>
       <w:lvlJc w:val="left"/>
@@ -8852,7 +9286,7 @@
       </w:pPr>
     </w:lvl>
     <w:lvl w:ilvl="3">
-      <w:start w:val="14"/>
+      <w:start w:val="15"/>
       <w:numFmt w:val="decimal"/>
       <w:lvlText w:val="%4."/>
       <w:lvlJc w:val="left"/>
@@ -8861,7 +9295,7 @@
       </w:pPr>
     </w:lvl>
     <w:lvl w:ilvl="4">
-      <w:start w:val="14"/>
+      <w:start w:val="15"/>
       <w:numFmt w:val="decimal"/>
       <w:lvlText w:val="%5."/>
       <w:lvlJc w:val="left"/>
@@ -8870,7 +9304,7 @@
       </w:pPr>
     </w:lvl>
     <w:lvl w:ilvl="5">
-      <w:start w:val="14"/>
+      <w:start w:val="15"/>
       <w:numFmt w:val="decimal"/>
       <w:lvlText w:val="%6."/>
       <w:lvlJc w:val="left"/>
@@ -8879,7 +9313,7 @@
       </w:pPr>
     </w:lvl>
     <w:lvl w:ilvl="6">
-      <w:start w:val="14"/>
+      <w:start w:val="15"/>
       <w:numFmt w:val="decimal"/>
       <w:lvlText w:val="%7."/>
       <w:lvlJc w:val="left"/>
@@ -8888,7 +9322,7 @@
       </w:pPr>
     </w:lvl>
     <w:lvl w:ilvl="7">
-      <w:start w:val="14"/>
+      <w:start w:val="15"/>
       <w:numFmt w:val="decimal"/>
       <w:lvlText w:val="%8."/>
       <w:lvlJc w:val="left"/>
@@ -8897,7 +9331,7 @@
       </w:pPr>
     </w:lvl>
     <w:lvl w:ilvl="8">
-      <w:start w:val="14"/>
+      <w:start w:val="15"/>
       <w:numFmt w:val="decimal"/>
       <w:lvlText w:val="%9."/>
       <w:lvlJc w:val="left"/>
@@ -8906,11 +9340,11 @@
       </w:pPr>
     </w:lvl>
   </w:abstractNum>
-  <w:abstractNum w:abstractNumId="994118">
-    <w:nsid w:val="0A994118"/>
+  <w:abstractNum w:abstractNumId="994119">
+    <w:nsid w:val="0A994119"/>
     <w:multiLevelType w:val="multilevel"/>
     <w:lvl w:ilvl="0">
-      <w:start w:val="18"/>
+      <w:start w:val="19"/>
       <w:numFmt w:val="decimal"/>
       <w:lvlText w:val="%1."/>
       <w:lvlJc w:val="left"/>
@@ -8919,7 +9353,7 @@
       </w:pPr>
     </w:lvl>
     <w:lvl w:ilvl="1">
-      <w:start w:val="18"/>
+      <w:start w:val="19"/>
       <w:numFmt w:val="decimal"/>
       <w:lvlText w:val="%2."/>
       <w:lvlJc w:val="left"/>
@@ -8928,7 +9362,7 @@
       </w:pPr>
     </w:lvl>
     <w:lvl w:ilvl="2">
-      <w:start w:val="18"/>
+      <w:start w:val="19"/>
       <w:numFmt w:val="decimal"/>
       <w:lvlText w:val="%3."/>
       <w:lvlJc w:val="left"/>
@@ -8937,7 +9371,7 @@
       </w:pPr>
     </w:lvl>
     <w:lvl w:ilvl="3">
-      <w:start w:val="18"/>
+      <w:start w:val="19"/>
       <w:numFmt w:val="decimal"/>
       <w:lvlText w:val="%4."/>
       <w:lvlJc w:val="left"/>
@@ -8946,7 +9380,7 @@
       </w:pPr>
     </w:lvl>
     <w:lvl w:ilvl="4">
-      <w:start w:val="18"/>
+      <w:start w:val="19"/>
       <w:numFmt w:val="decimal"/>
       <w:lvlText w:val="%5."/>
       <w:lvlJc w:val="left"/>
@@ -8955,7 +9389,7 @@
       </w:pPr>
     </w:lvl>
     <w:lvl w:ilvl="5">
-      <w:start w:val="18"/>
+      <w:start w:val="19"/>
       <w:numFmt w:val="decimal"/>
       <w:lvlText w:val="%6."/>
       <w:lvlJc w:val="left"/>
@@ -8964,7 +9398,7 @@
       </w:pPr>
     </w:lvl>
     <w:lvl w:ilvl="6">
-      <w:start w:val="18"/>
+      <w:start w:val="19"/>
       <w:numFmt w:val="decimal"/>
       <w:lvlText w:val="%7."/>
       <w:lvlJc w:val="left"/>
@@ -8973,7 +9407,7 @@
       </w:pPr>
     </w:lvl>
     <w:lvl w:ilvl="7">
-      <w:start w:val="18"/>
+      <w:start w:val="19"/>
       <w:numFmt w:val="decimal"/>
       <w:lvlText w:val="%8."/>
       <w:lvlJc w:val="left"/>
@@ -8982,7 +9416,7 @@
       </w:pPr>
     </w:lvl>
     <w:lvl w:ilvl="8">
-      <w:start w:val="18"/>
+      <w:start w:val="19"/>
       <w:numFmt w:val="decimal"/>
       <w:lvlText w:val="%9."/>
       <w:lvlJc w:val="left"/>
@@ -9217,93 +9651,93 @@
     </w:lvlOverride>
   </w:num>
   <w:num w:numId="1021">
-    <w:abstractNumId w:val="994110"/>
+    <w:abstractNumId w:val="994111"/>
     <w:lvlOverride w:ilvl="0">
-      <w:startOverride w:val="10"/>
+      <w:startOverride w:val="11"/>
     </w:lvlOverride>
     <w:lvlOverride w:ilvl="1">
-      <w:startOverride w:val="10"/>
+      <w:startOverride w:val="11"/>
     </w:lvlOverride>
     <w:lvlOverride w:ilvl="2">
-      <w:startOverride w:val="10"/>
+      <w:startOverride w:val="11"/>
     </w:lvlOverride>
     <w:lvlOverride w:ilvl="3">
-      <w:startOverride w:val="10"/>
+      <w:startOverride w:val="11"/>
     </w:lvlOverride>
     <w:lvlOverride w:ilvl="4">
-      <w:startOverride w:val="10"/>
+      <w:startOverride w:val="11"/>
     </w:lvlOverride>
     <w:lvlOverride w:ilvl="5">
-      <w:startOverride w:val="10"/>
+      <w:startOverride w:val="11"/>
     </w:lvlOverride>
     <w:lvlOverride w:ilvl="6">
-      <w:startOverride w:val="10"/>
+      <w:startOverride w:val="11"/>
     </w:lvlOverride>
     <w:lvlOverride w:ilvl="7">
-      <w:startOverride w:val="10"/>
+      <w:startOverride w:val="11"/>
     </w:lvlOverride>
     <w:lvlOverride w:ilvl="8">
-      <w:startOverride w:val="10"/>
+      <w:startOverride w:val="11"/>
     </w:lvlOverride>
   </w:num>
   <w:num w:numId="1022">
-    <w:abstractNumId w:val="994114"/>
+    <w:abstractNumId w:val="994115"/>
     <w:lvlOverride w:ilvl="0">
-      <w:startOverride w:val="14"/>
+      <w:startOverride w:val="15"/>
     </w:lvlOverride>
     <w:lvlOverride w:ilvl="1">
-      <w:startOverride w:val="14"/>
+      <w:startOverride w:val="15"/>
     </w:lvlOverride>
     <w:lvlOverride w:ilvl="2">
-      <w:startOverride w:val="14"/>
+      <w:startOverride w:val="15"/>
     </w:lvlOverride>
     <w:lvlOverride w:ilvl="3">
-      <w:startOverride w:val="14"/>
+      <w:startOverride w:val="15"/>
     </w:lvlOverride>
     <w:lvlOverride w:ilvl="4">
-      <w:startOverride w:val="14"/>
+      <w:startOverride w:val="15"/>
     </w:lvlOverride>
     <w:lvlOverride w:ilvl="5">
-      <w:startOverride w:val="14"/>
+      <w:startOverride w:val="15"/>
     </w:lvlOverride>
     <w:lvlOverride w:ilvl="6">
-      <w:startOverride w:val="14"/>
+      <w:startOverride w:val="15"/>
     </w:lvlOverride>
     <w:lvlOverride w:ilvl="7">
-      <w:startOverride w:val="14"/>
+      <w:startOverride w:val="15"/>
     </w:lvlOverride>
     <w:lvlOverride w:ilvl="8">
-      <w:startOverride w:val="14"/>
+      <w:startOverride w:val="15"/>
     </w:lvlOverride>
   </w:num>
   <w:num w:numId="1023">
-    <w:abstractNumId w:val="994118"/>
+    <w:abstractNumId w:val="994119"/>
     <w:lvlOverride w:ilvl="0">
-      <w:startOverride w:val="18"/>
+      <w:startOverride w:val="19"/>
     </w:lvlOverride>
     <w:lvlOverride w:ilvl="1">
-      <w:startOverride w:val="18"/>
+      <w:startOverride w:val="19"/>
     </w:lvlOverride>
     <w:lvlOverride w:ilvl="2">
-      <w:startOverride w:val="18"/>
+      <w:startOverride w:val="19"/>
     </w:lvlOverride>
     <w:lvlOverride w:ilvl="3">
-      <w:startOverride w:val="18"/>
+      <w:startOverride w:val="19"/>
     </w:lvlOverride>
     <w:lvlOverride w:ilvl="4">
-      <w:startOverride w:val="18"/>
+      <w:startOverride w:val="19"/>
     </w:lvlOverride>
     <w:lvlOverride w:ilvl="5">
-      <w:startOverride w:val="18"/>
+      <w:startOverride w:val="19"/>
     </w:lvlOverride>
     <w:lvlOverride w:ilvl="6">
-      <w:startOverride w:val="18"/>
+      <w:startOverride w:val="19"/>
     </w:lvlOverride>
     <w:lvlOverride w:ilvl="7">
-      <w:startOverride w:val="18"/>
+      <w:startOverride w:val="19"/>
     </w:lvlOverride>
     <w:lvlOverride w:ilvl="8">
-      <w:startOverride w:val="18"/>
+      <w:startOverride w:val="19"/>
     </w:lvlOverride>
   </w:num>
   <w:num w:numId="1024">

</xml_diff>

<commit_message>
Add Dynatrace Intelligence feature via Davis CoPilot (v0.4.104)
- Add AIAssist.tsx and DynatraceIntelligence.tsx (copied from cio-overview-app)
- Add DTIntelligenceButton to header toolbar (left of refresh button)
- Add dtIntelligenceEnabled global setting toggle (default off) in General settings
- Add davis-copilot:conversations:execute scope to app.config.json
- Install @dynatrace-sdk/client-davis-copilot dependency
- NavigatorIQ-specific prompt builder uses live assessment + all domain metrics

Co-Authored-By: Claude Sonnet 4.6 <noreply@anthropic.com>
</commit_message>
<xml_diff>
--- a/USER_GUIDE.docx
+++ b/USER_GUIDE.docx
@@ -2,7 +2,7 @@
 <file path=word/document.xml><?xml version="1.0" encoding="utf-8"?>
 <w:document xmlns:w="http://schemas.openxmlformats.org/wordprocessingml/2006/main" xmlns:m="http://schemas.openxmlformats.org/officeDocument/2006/math" xmlns:r="http://schemas.openxmlformats.org/officeDocument/2006/relationships" xmlns:o="urn:schemas-microsoft-com:office:office" xmlns:v="urn:schemas-microsoft-com:vml" xmlns:w10="urn:schemas-microsoft-com:office:word" xmlns:a="http://schemas.openxmlformats.org/drawingml/2006/main" xmlns:pic="http://schemas.openxmlformats.org/drawingml/2006/picture" xmlns:wp="http://schemas.openxmlformats.org/drawingml/2006/wordprocessingDrawing">
   <w:body>
-    <w:bookmarkStart w:id="89" w:name="navigatoriq-launcher-user-guide"/>
+    <w:bookmarkStart w:id="94" w:name="navigatoriq-launcher-user-guide"/>
     <w:p>
       <w:pPr>
         <w:pStyle w:val="Heading1"/>
@@ -26,7 +26,7 @@
         <w:t xml:space="preserve"> </w:t>
       </w:r>
       <w:r>
-        <w:t xml:space="preserve">0.4.75 |</w:t>
+        <w:t xml:space="preserve">0.4.102 |</w:t>
       </w:r>
       <w:r>
         <w:t xml:space="preserve"> </w:t>
@@ -306,7 +306,24 @@
           <w:numId w:val="1001"/>
         </w:numPr>
       </w:pPr>
-      <w:hyperlink w:anchor="X15172fb00b23284249a2374079615bda051b951">
+      <w:hyperlink w:anchor="Xc3605c8b8c813a336e427d70f6620cd1bd8066b">
+        <w:r>
+          <w:rPr>
+            <w:rStyle w:val="Hyperlink"/>
+          </w:rPr>
+          <w:t xml:space="preserve">Automate — Weekly Report Workflow</w:t>
+        </w:r>
+      </w:hyperlink>
+    </w:p>
+    <w:p>
+      <w:pPr>
+        <w:pStyle w:val="Compact"/>
+        <w:numPr>
+          <w:ilvl w:val="0"/>
+          <w:numId w:val="1001"/>
+        </w:numPr>
+      </w:pPr>
+      <w:hyperlink w:anchor="X48bf8f6b79c862fce688d269a142def113936f6">
         <w:r>
           <w:rPr>
             <w:rStyle w:val="Hyperlink"/>
@@ -323,7 +340,7 @@
           <w:numId w:val="1001"/>
         </w:numPr>
       </w:pPr>
-      <w:hyperlink w:anchor="Xca2450ebfe8ecee4654e0979abff20e9fdd4964">
+      <w:hyperlink w:anchor="Xa5bb527f3825631b441c1a198c596fefeed8c7b">
         <w:r>
           <w:rPr>
             <w:rStyle w:val="Hyperlink"/>
@@ -340,7 +357,7 @@
           <w:numId w:val="1001"/>
         </w:numPr>
       </w:pPr>
-      <w:hyperlink w:anchor="X53339fd4dadfe5b2308730884bd18ea0d74adc8">
+      <w:hyperlink w:anchor="Xd35cfe2ba088ec22fc6f9f991fc4ceec60037d9">
         <w:r>
           <w:rPr>
             <w:rStyle w:val="Hyperlink"/>
@@ -357,7 +374,7 @@
           <w:numId w:val="1001"/>
         </w:numPr>
       </w:pPr>
-      <w:hyperlink w:anchor="X0181f4f5593b8646871551a0333c7241052ec22">
+      <w:hyperlink w:anchor="X7448d5ca34c0e3d57bf3f3e1e20da2ebe76f959">
         <w:r>
           <w:rPr>
             <w:rStyle w:val="Hyperlink"/>
@@ -374,7 +391,7 @@
           <w:numId w:val="1001"/>
         </w:numPr>
       </w:pPr>
-      <w:hyperlink w:anchor="Xaa0d69c7b4ce71e53b2d00d47881e38caa84601">
+      <w:hyperlink w:anchor="Xd2bb0e230fb0ee7db7b15e99745dd551c0d4330">
         <w:r>
           <w:rPr>
             <w:rStyle w:val="Hyperlink"/>
@@ -391,7 +408,7 @@
           <w:numId w:val="1001"/>
         </w:numPr>
       </w:pPr>
-      <w:hyperlink w:anchor="Xe0509e463d97c090824741f9b8a5b725aee2d2c">
+      <w:hyperlink w:anchor="Xb811b17cfd0ddba9bbf96f4804204cbee772cbf">
         <w:r>
           <w:rPr>
             <w:rStyle w:val="Hyperlink"/>
@@ -1420,7 +1437,7 @@
     </w:p>
     <w:bookmarkEnd w:id="18"/>
     <w:bookmarkEnd w:id="19"/>
-    <w:bookmarkStart w:id="24" w:name="understanding-the-heat-strip"/>
+    <w:bookmarkStart w:id="25" w:name="understanding-the-heat-strip"/>
     <w:p>
       <w:pPr>
         <w:pStyle w:val="Heading2"/>
@@ -1995,7 +2012,7 @@
               <w:pStyle w:val="Compact"/>
             </w:pPr>
             <w:r>
-              <w:t xml:space="preserve">Highlights the range in blue; releasing opens</w:t>
+              <w:t xml:space="preserve">Highlights the range with a blue outline; releasing</w:t>
             </w:r>
             <w:r>
               <w:t xml:space="preserve"> </w:t>
@@ -2005,13 +2022,13 @@
                 <w:b/>
                 <w:bCs/>
               </w:rPr>
-              <w:t xml:space="preserve">Bucket Diagnosis</w:t>
+              <w:t xml:space="preserve">zooms the entire app</w:t>
             </w:r>
             <w:r>
               <w:t xml:space="preserve"> </w:t>
             </w:r>
             <w:r>
-              <w:t xml:space="preserve">for the hottest bucket in the selected range</w:t>
+              <w:t xml:space="preserve">into that time window</w:t>
             </w:r>
           </w:p>
         </w:tc>
@@ -2157,6 +2174,73 @@
         </w:tc>
       </w:tr>
     </w:tbl>
+    <w:bookmarkEnd w:id="23"/>
+    <w:bookmarkStart w:id="24" w:name="drag-to-zoom"/>
+    <w:p>
+      <w:pPr>
+        <w:pStyle w:val="Heading3"/>
+      </w:pPr>
+      <w:r>
+        <w:t xml:space="preserve">Drag-to-zoom</w:t>
+      </w:r>
+    </w:p>
+    <w:p>
+      <w:pPr>
+        <w:pStyle w:val="FirstParagraph"/>
+      </w:pPr>
+      <w:r>
+        <w:t xml:space="preserve">When you release a drag-select, NavigatorIQ sets a</w:t>
+      </w:r>
+      <w:r>
+        <w:t xml:space="preserve"> </w:t>
+      </w:r>
+      <w:r>
+        <w:rPr>
+          <w:b/>
+          <w:bCs/>
+        </w:rPr>
+        <w:t xml:space="preserve">custom zoom window</w:t>
+      </w:r>
+      <w:r>
+        <w:t xml:space="preserve"> </w:t>
+      </w:r>
+      <w:r>
+        <w:t xml:space="preserve">covering the selected bars. A blue banner appears below the header showing the zoomed time range (e.g. </w:t>
+      </w:r>
+      <w:r>
+        <w:rPr>
+          <w:rStyle w:val="VerbatimChar"/>
+        </w:rPr>
+        <w:t xml:space="preserve">10/7 14:30 → 10/7 16:00</w:t>
+      </w:r>
+      <w:r>
+        <w:t xml:space="preserve">) and the effective bucket size. All queries — heat strip, assessment, narrative, and every panel — reload against this custom window.</w:t>
+      </w:r>
+    </w:p>
+    <w:p>
+      <w:pPr>
+        <w:pStyle w:val="BodyText"/>
+      </w:pPr>
+      <w:r>
+        <w:t xml:space="preserve">Click</w:t>
+      </w:r>
+      <w:r>
+        <w:t xml:space="preserve"> </w:t>
+      </w:r>
+      <w:r>
+        <w:rPr>
+          <w:b/>
+          <w:bCs/>
+        </w:rPr>
+        <w:t xml:space="preserve">✕ Exit zoom</w:t>
+      </w:r>
+      <w:r>
+        <w:t xml:space="preserve"> </w:t>
+      </w:r>
+      <w:r>
+        <w:t xml:space="preserve">in the banner to return to the full timeframe tab.</w:t>
+      </w:r>
+    </w:p>
     <w:p>
       <w:pPr>
         <w:pStyle w:val="BlockText"/>
@@ -2166,13 +2250,13 @@
           <w:b/>
           <w:bCs/>
         </w:rPr>
-        <w:t xml:space="preserve">Drag-select tip:</w:t>
-      </w:r>
-      <w:r>
-        <w:t xml:space="preserve"> </w:t>
-      </w:r>
-      <w:r>
-        <w:t xml:space="preserve">Use drag-select to zoom into a suspicious window. For example, if you see three consecutive red bars in a 7-day view, drag across them to immediately open diagnosis for the worst moment in that period.</w:t>
+        <w:t xml:space="preserve">When to use zoom:</w:t>
+      </w:r>
+      <w:r>
+        <w:t xml:space="preserve"> </w:t>
+      </w:r>
+      <w:r>
+        <w:t xml:space="preserve">If you see three consecutive red bars in a 7-day view, drag across them to instantly reload all data for that specific window at a finer granularity. Zoom picks the tightest bucket size that fits (down to 1-minute buckets for windows under 30 minutes).</w:t>
       </w:r>
     </w:p>
     <w:p>
@@ -2182,9 +2266,9 @@
         </w:pict>
       </w:r>
     </w:p>
-    <w:bookmarkEnd w:id="23"/>
     <w:bookmarkEnd w:id="24"/>
-    <w:bookmarkStart w:id="27" w:name="navigatoriq-launcher-intelligence"/>
+    <w:bookmarkEnd w:id="25"/>
+    <w:bookmarkStart w:id="28" w:name="navigatoriq-launcher-intelligence"/>
     <w:p>
       <w:pPr>
         <w:pStyle w:val="Heading2"/>
@@ -2217,7 +2301,7 @@
         <w:t xml:space="preserve">section generates a plain-language narrative of the current assessment. The text prints word by word — like a response from an AI assistant — so you can read it as it builds rather than waiting for a wall of text.</w:t>
       </w:r>
     </w:p>
-    <w:bookmarkStart w:id="25" w:name="what-the-narrative-includes"/>
+    <w:bookmarkStart w:id="26" w:name="what-the-narrative-includes"/>
     <w:p>
       <w:pPr>
         <w:pStyle w:val="Heading3"/>
@@ -2346,8 +2430,8 @@
         <w:t xml:space="preserve">— when everything is green, the narrative confirms the metric values that validated the healthy status</w:t>
       </w:r>
     </w:p>
-    <w:bookmarkEnd w:id="25"/>
-    <w:bookmarkStart w:id="26" w:name="when-it-refreshes"/>
+    <w:bookmarkEnd w:id="26"/>
+    <w:bookmarkStart w:id="27" w:name="when-it-refreshes"/>
     <w:p>
       <w:pPr>
         <w:pStyle w:val="Heading3"/>
@@ -2395,9 +2479,9 @@
         </w:pict>
       </w:r>
     </w:p>
-    <w:bookmarkEnd w:id="26"/>
     <w:bookmarkEnd w:id="27"/>
-    <w:bookmarkStart w:id="30" w:name="assessment-panel"/>
+    <w:bookmarkEnd w:id="28"/>
+    <w:bookmarkStart w:id="31" w:name="assessment-panel"/>
     <w:p>
       <w:pPr>
         <w:pStyle w:val="Heading2"/>
@@ -2414,7 +2498,7 @@
         <w:t xml:space="preserve">The assessment panel lists every monitored metric for the current persona with a Red / Yellow / Green status badge, the current value, the trend vs the previous period, and a delta percentage.</w:t>
       </w:r>
     </w:p>
-    <w:bookmarkStart w:id="28" w:name="status-thresholds"/>
+    <w:bookmarkStart w:id="29" w:name="status-thresholds"/>
     <w:p>
       <w:pPr>
         <w:pStyle w:val="Heading3"/>
@@ -2598,8 +2682,8 @@
         </w:tc>
       </w:tr>
     </w:tbl>
-    <w:bookmarkEnd w:id="28"/>
-    <w:bookmarkStart w:id="29" w:name="assessment-actions"/>
+    <w:bookmarkEnd w:id="29"/>
+    <w:bookmarkStart w:id="30" w:name="assessment-actions"/>
     <w:p>
       <w:pPr>
         <w:pStyle w:val="Heading3"/>
@@ -2689,9 +2773,9 @@
         </w:pict>
       </w:r>
     </w:p>
-    <w:bookmarkEnd w:id="29"/>
     <w:bookmarkEnd w:id="30"/>
-    <w:bookmarkStart w:id="33" w:name="bucket-diagnosis-why-is-this-hot"/>
+    <w:bookmarkEnd w:id="31"/>
+    <w:bookmarkStart w:id="34" w:name="bucket-diagnosis-why-is-this-hot"/>
     <w:p>
       <w:pPr>
         <w:pStyle w:val="Heading2"/>
@@ -2724,7 +2808,7 @@
         <w:t xml:space="preserve">— a draggable, scrollable popup that shows every heat metric’s value for that specific time window.</w:t>
       </w:r>
     </w:p>
-    <w:bookmarkStart w:id="31" w:name="what-you-see"/>
+    <w:bookmarkStart w:id="32" w:name="what-you-see"/>
     <w:p>
       <w:pPr>
         <w:pStyle w:val="Heading3"/>
@@ -2769,8 +2853,8 @@
         <w:t xml:space="preserve">The bucket’s start/end time is shown at the top so you can cross-reference in other apps</w:t>
       </w:r>
     </w:p>
-    <w:bookmarkEnd w:id="31"/>
-    <w:bookmarkStart w:id="32" w:name="drilling-deeper"/>
+    <w:bookmarkEnd w:id="32"/>
+    <w:bookmarkStart w:id="33" w:name="drilling-deeper"/>
     <w:p>
       <w:pPr>
         <w:pStyle w:val="Heading3"/>
@@ -2929,9 +3013,9 @@
         </w:pict>
       </w:r>
     </w:p>
-    <w:bookmarkEnd w:id="32"/>
     <w:bookmarkEnd w:id="33"/>
-    <w:bookmarkStart w:id="37" w:name="explore-metric-drill-down"/>
+    <w:bookmarkEnd w:id="34"/>
+    <w:bookmarkStart w:id="38" w:name="explore-metric-drill-down"/>
     <w:p>
       <w:pPr>
         <w:pStyle w:val="Heading2"/>
@@ -2964,7 +3048,7 @@
         <w:t xml:space="preserve">panel opens from an assessment item or from a row in Bucket Diagnosis. It provides a single-metric deep dive.</w:t>
       </w:r>
     </w:p>
-    <w:bookmarkStart w:id="34" w:name="contents"/>
+    <w:bookmarkStart w:id="35" w:name="contents"/>
     <w:p>
       <w:pPr>
         <w:pStyle w:val="Heading3"/>
@@ -3058,11 +3142,11 @@
         <w:t xml:space="preserve"> </w:t>
       </w:r>
       <w:r>
-        <w:t xml:space="preserve">— opens the relevant Dynatrace app directly (Services, Logs, Infra, etc.)</w:t>
-      </w:r>
-    </w:p>
-    <w:bookmarkEnd w:id="34"/>
-    <w:bookmarkStart w:id="35" w:name="digital-experience-extras"/>
+        <w:t xml:space="preserve">— opens the relevant Dynatrace app directly (Services, Logs, Infra, etc.) with the current timeframe pre-applied so you land at exactly the right time window</w:t>
+      </w:r>
+    </w:p>
+    <w:bookmarkEnd w:id="35"/>
+    <w:bookmarkStart w:id="36" w:name="digital-experience-extras"/>
     <w:p>
       <w:pPr>
         <w:pStyle w:val="Heading3"/>
@@ -3113,8 +3197,8 @@
         <w:t xml:space="preserve">- Export to HTML for sharing in incident reports</w:t>
       </w:r>
     </w:p>
-    <w:bookmarkEnd w:id="35"/>
-    <w:bookmarkStart w:id="36" w:name="usability"/>
+    <w:bookmarkEnd w:id="36"/>
+    <w:bookmarkStart w:id="37" w:name="usability"/>
     <w:p>
       <w:pPr>
         <w:pStyle w:val="Heading3"/>
@@ -3170,9 +3254,9 @@
         </w:pict>
       </w:r>
     </w:p>
-    <w:bookmarkEnd w:id="36"/>
     <w:bookmarkEnd w:id="37"/>
-    <w:bookmarkStart w:id="40" w:name="hotness-assist"/>
+    <w:bookmarkEnd w:id="38"/>
+    <w:bookmarkStart w:id="41" w:name="hotness-assist"/>
     <w:p>
       <w:pPr>
         <w:pStyle w:val="Heading2"/>
@@ -3215,7 +3299,7 @@
         <w:t xml:space="preserve">in the heat strip header. The panel is draggable.</w:t>
       </w:r>
     </w:p>
-    <w:bookmarkStart w:id="38" w:name="kpi-tiles-top-row"/>
+    <w:bookmarkStart w:id="39" w:name="kpi-tiles-top-row"/>
     <w:p>
       <w:pPr>
         <w:pStyle w:val="Heading3"/>
@@ -3358,8 +3442,8 @@
         </w:tc>
       </w:tr>
     </w:tbl>
-    <w:bookmarkEnd w:id="38"/>
-    <w:bookmarkStart w:id="39" w:name="analysis-sections"/>
+    <w:bookmarkEnd w:id="39"/>
+    <w:bookmarkStart w:id="40" w:name="analysis-sections"/>
     <w:p>
       <w:pPr>
         <w:pStyle w:val="Heading3"/>
@@ -4120,9 +4204,9 @@
         </w:pict>
       </w:r>
     </w:p>
-    <w:bookmarkEnd w:id="39"/>
     <w:bookmarkEnd w:id="40"/>
-    <w:bookmarkStart w:id="44" w:name="hotness-calendar"/>
+    <w:bookmarkEnd w:id="41"/>
+    <w:bookmarkStart w:id="45" w:name="hotness-calendar"/>
     <w:p>
       <w:pPr>
         <w:pStyle w:val="Heading2"/>
@@ -4187,7 +4271,7 @@
         <w:t xml:space="preserve">your environment typically runs hot.</w:t>
       </w:r>
     </w:p>
-    <w:bookmarkStart w:id="41" w:name="how-to-read-it"/>
+    <w:bookmarkStart w:id="42" w:name="how-to-read-it"/>
     <w:p>
       <w:pPr>
         <w:pStyle w:val="Heading3"/>
@@ -4244,8 +4328,8 @@
         <w:t xml:space="preserve">Colors use the same scale as the heat strip</w:t>
       </w:r>
     </w:p>
-    <w:bookmarkEnd w:id="41"/>
-    <w:bookmarkStart w:id="42" w:name="history-window"/>
+    <w:bookmarkEnd w:id="42"/>
+    <w:bookmarkStart w:id="43" w:name="history-window"/>
     <w:p>
       <w:pPr>
         <w:pStyle w:val="Heading3"/>
@@ -4304,8 +4388,8 @@
         <w:t xml:space="preserve">of history. The calendar re-queries at each selection.</w:t>
       </w:r>
     </w:p>
-    <w:bookmarkEnd w:id="42"/>
-    <w:bookmarkStart w:id="43" w:name="use-cases"/>
+    <w:bookmarkEnd w:id="43"/>
+    <w:bookmarkStart w:id="44" w:name="use-cases"/>
     <w:p>
       <w:pPr>
         <w:pStyle w:val="Heading3"/>
@@ -4532,9 +4616,9 @@
         </w:pict>
       </w:r>
     </w:p>
-    <w:bookmarkEnd w:id="43"/>
     <w:bookmarkEnd w:id="44"/>
-    <w:bookmarkStart w:id="48" w:name="kpi-heatmap"/>
+    <w:bookmarkEnd w:id="45"/>
+    <w:bookmarkStart w:id="49" w:name="kpi-heatmap"/>
     <w:p>
       <w:pPr>
         <w:pStyle w:val="Heading2"/>
@@ -4583,7 +4667,7 @@
         <w:t xml:space="preserve">— a day × hour calendar scoped to that single metric, showing its raw value (not Z-score) in each cell.</w:t>
       </w:r>
     </w:p>
-    <w:bookmarkStart w:id="45" w:name="difference-from-hotness-calendar"/>
+    <w:bookmarkStart w:id="46" w:name="difference-from-hotness-calendar"/>
     <w:p>
       <w:pPr>
         <w:pStyle w:val="Heading3"/>
@@ -4761,8 +4845,8 @@
         </w:tc>
       </w:tr>
     </w:tbl>
-    <w:bookmarkEnd w:id="45"/>
-    <w:bookmarkStart w:id="46" w:name="features"/>
+    <w:bookmarkEnd w:id="46"/>
+    <w:bookmarkStart w:id="47" w:name="features"/>
     <w:p>
       <w:pPr>
         <w:pStyle w:val="Heading3"/>
@@ -4807,8 +4891,52 @@
         <w:t xml:space="preserve">Color scale uses relative Z-scoring within the metric’s own history, so low-variance metrics still show variation</w:t>
       </w:r>
     </w:p>
-    <w:bookmarkEnd w:id="46"/>
-    <w:bookmarkStart w:id="47" w:name="use-cases-1"/>
+    <w:p>
+      <w:pPr>
+        <w:pStyle w:val="Compact"/>
+        <w:numPr>
+          <w:ilvl w:val="0"/>
+          <w:numId w:val="1011"/>
+        </w:numPr>
+      </w:pPr>
+      <w:r>
+        <w:rPr>
+          <w:b/>
+          <w:bCs/>
+        </w:rPr>
+        <w:t xml:space="preserve">Clickable insight cards</w:t>
+      </w:r>
+      <w:r>
+        <w:t xml:space="preserve"> </w:t>
+      </w:r>
+      <w:r>
+        <w:t xml:space="preserve">— the Analyze section shows insight cards (Hot Zone, Worst Hour, Worst Day, Best Hour, Best Day). Click a card to highlight the corresponding rows or columns in the heatmap grid. Click the card again (or the legend’s Clear button) to remove the highlight.</w:t>
+      </w:r>
+    </w:p>
+    <w:p>
+      <w:pPr>
+        <w:pStyle w:val="Compact"/>
+        <w:numPr>
+          <w:ilvl w:val="0"/>
+          <w:numId w:val="1011"/>
+        </w:numPr>
+      </w:pPr>
+      <w:r>
+        <w:rPr>
+          <w:b/>
+          <w:bCs/>
+        </w:rPr>
+        <w:t xml:space="preserve">Legend filter</w:t>
+      </w:r>
+      <w:r>
+        <w:t xml:space="preserve"> </w:t>
+      </w:r>
+      <w:r>
+        <w:t xml:space="preserve">— click any color band in the legend to dim cells outside that heat level, isolating only the cells you care about</w:t>
+      </w:r>
+    </w:p>
+    <w:bookmarkEnd w:id="47"/>
+    <w:bookmarkStart w:id="48" w:name="use-cases-1"/>
     <w:p>
       <w:pPr>
         <w:pStyle w:val="Heading3"/>
@@ -4860,9 +4988,9 @@
         </w:pict>
       </w:r>
     </w:p>
-    <w:bookmarkEnd w:id="47"/>
     <w:bookmarkEnd w:id="48"/>
-    <w:bookmarkStart w:id="52" w:name="forecast"/>
+    <w:bookmarkEnd w:id="49"/>
+    <w:bookmarkStart w:id="53" w:name="forecast"/>
     <w:p>
       <w:pPr>
         <w:pStyle w:val="Heading2"/>
@@ -4911,7 +5039,7 @@
         <w:t xml:space="preserve">button. It projects a metric’s trend forward using statistical models.</w:t>
       </w:r>
     </w:p>
-    <w:bookmarkStart w:id="49" w:name="available-models"/>
+    <w:bookmarkStart w:id="50" w:name="available-models"/>
     <w:p>
       <w:pPr>
         <w:pStyle w:val="Heading3"/>
@@ -5127,8 +5255,8 @@
         </w:tc>
       </w:tr>
     </w:tbl>
-    <w:bookmarkEnd w:id="49"/>
-    <w:bookmarkStart w:id="50" w:name="reading-the-chart"/>
+    <w:bookmarkEnd w:id="50"/>
+    <w:bookmarkStart w:id="51" w:name="reading-the-chart"/>
     <w:p>
       <w:pPr>
         <w:pStyle w:val="Heading3"/>
@@ -5203,8 +5331,8 @@
         <w:t xml:space="preserve">— confidence interval (wider = less certain)</w:t>
       </w:r>
     </w:p>
-    <w:bookmarkEnd w:id="50"/>
-    <w:bookmarkStart w:id="51" w:name="selecting-a-model"/>
+    <w:bookmarkEnd w:id="51"/>
+    <w:bookmarkStart w:id="52" w:name="selecting-a-model"/>
     <w:p>
       <w:pPr>
         <w:pStyle w:val="Heading3"/>
@@ -5236,9 +5364,9 @@
         </w:pict>
       </w:r>
     </w:p>
-    <w:bookmarkEnd w:id="51"/>
     <w:bookmarkEnd w:id="52"/>
-    <w:bookmarkStart w:id="53" w:name="app-links-panel"/>
+    <w:bookmarkEnd w:id="53"/>
+    <w:bookmarkStart w:id="54" w:name="app-links-panel"/>
     <w:p>
       <w:pPr>
         <w:pStyle w:val="Heading2"/>
@@ -5428,14 +5556,14 @@
         </w:pict>
       </w:r>
     </w:p>
-    <w:bookmarkEnd w:id="53"/>
-    <w:bookmarkStart w:id="58" w:name="settings-personal"/>
+    <w:bookmarkEnd w:id="54"/>
+    <w:bookmarkStart w:id="58" w:name="automate-weekly-report-workflow"/>
     <w:p>
       <w:pPr>
         <w:pStyle w:val="Heading2"/>
       </w:pPr>
       <w:r>
-        <w:t xml:space="preserve">14. Settings — Personal</w:t>
+        <w:t xml:space="preserve">14. Automate — Weekly Report Workflow</w:t>
       </w:r>
     </w:p>
     <w:p>
@@ -5443,6 +5571,395 @@
         <w:pStyle w:val="FirstParagraph"/>
       </w:pPr>
       <w:r>
+        <w:t xml:space="preserve">The</w:t>
+      </w:r>
+      <w:r>
+        <w:t xml:space="preserve"> </w:t>
+      </w:r>
+      <w:r>
+        <w:rPr>
+          <w:b/>
+          <w:bCs/>
+        </w:rPr>
+        <w:t xml:space="preserve">Automate</w:t>
+      </w:r>
+      <w:r>
+        <w:t xml:space="preserve"> </w:t>
+      </w:r>
+      <w:r>
+        <w:t xml:space="preserve">button (grid icon, ⠿) in the header generates a ready-to-import Dynatrace Workflow that sends a weekly metric report for the current persona.</w:t>
+      </w:r>
+    </w:p>
+    <w:bookmarkStart w:id="55" w:name="what-it-does"/>
+    <w:p>
+      <w:pPr>
+        <w:pStyle w:val="Heading3"/>
+      </w:pPr>
+      <w:r>
+        <w:t xml:space="preserve">What it does</w:t>
+      </w:r>
+    </w:p>
+    <w:p>
+      <w:pPr>
+        <w:pStyle w:val="FirstParagraph"/>
+      </w:pPr>
+      <w:r>
+        <w:t xml:space="preserve">The generated workflow runs</w:t>
+      </w:r>
+      <w:r>
+        <w:t xml:space="preserve"> </w:t>
+      </w:r>
+      <w:r>
+        <w:rPr>
+          <w:b/>
+          <w:bCs/>
+        </w:rPr>
+        <w:t xml:space="preserve">every Monday at 8:00 AM</w:t>
+      </w:r>
+      <w:r>
+        <w:t xml:space="preserve"> </w:t>
+      </w:r>
+      <w:r>
+        <w:t xml:space="preserve">and:</w:t>
+      </w:r>
+    </w:p>
+    <w:p>
+      <w:pPr>
+        <w:pStyle w:val="Compact"/>
+        <w:numPr>
+          <w:ilvl w:val="0"/>
+          <w:numId w:val="1014"/>
+        </w:numPr>
+      </w:pPr>
+      <w:r>
+        <w:t xml:space="preserve">Queries each of the persona’s heat metrics over the last 7 days using DQL</w:t>
+      </w:r>
+    </w:p>
+    <w:p>
+      <w:pPr>
+        <w:pStyle w:val="Compact"/>
+        <w:numPr>
+          <w:ilvl w:val="0"/>
+          <w:numId w:val="1014"/>
+        </w:numPr>
+      </w:pPr>
+      <w:r>
+        <w:t xml:space="preserve">Sends each metric’s data to Dynatrace Intelligence for a 2–3 sentence health summary</w:t>
+      </w:r>
+    </w:p>
+    <w:p>
+      <w:pPr>
+        <w:pStyle w:val="Compact"/>
+        <w:numPr>
+          <w:ilvl w:val="0"/>
+          <w:numId w:val="1014"/>
+        </w:numPr>
+      </w:pPr>
+      <w:r>
+        <w:t xml:space="preserve">Compiles all per-metric summaries into an overall executive report (Executive Summary, Key Findings, Trends, Recommendations)</w:t>
+      </w:r>
+    </w:p>
+    <w:p>
+      <w:pPr>
+        <w:pStyle w:val="Compact"/>
+        <w:numPr>
+          <w:ilvl w:val="0"/>
+          <w:numId w:val="1014"/>
+        </w:numPr>
+      </w:pPr>
+      <w:r>
+        <w:t xml:space="preserve">Emails the finished report to the address you specify</w:t>
+      </w:r>
+    </w:p>
+    <w:bookmarkEnd w:id="55"/>
+    <w:bookmarkStart w:id="56" w:name="how-to-use-it"/>
+    <w:p>
+      <w:pPr>
+        <w:pStyle w:val="Heading3"/>
+      </w:pPr>
+      <w:r>
+        <w:t xml:space="preserve">How to use it</w:t>
+      </w:r>
+    </w:p>
+    <w:p>
+      <w:pPr>
+        <w:pStyle w:val="Compact"/>
+        <w:numPr>
+          <w:ilvl w:val="0"/>
+          <w:numId w:val="1015"/>
+        </w:numPr>
+      </w:pPr>
+      <w:r>
+        <w:t xml:space="preserve">Click the</w:t>
+      </w:r>
+      <w:r>
+        <w:t xml:space="preserve"> </w:t>
+      </w:r>
+      <w:r>
+        <w:rPr>
+          <w:b/>
+          <w:bCs/>
+        </w:rPr>
+        <w:t xml:space="preserve">Automate</w:t>
+      </w:r>
+      <w:r>
+        <w:t xml:space="preserve"> </w:t>
+      </w:r>
+      <w:r>
+        <w:t xml:space="preserve">button (grid icon) in the header</w:t>
+      </w:r>
+    </w:p>
+    <w:p>
+      <w:pPr>
+        <w:pStyle w:val="Compact"/>
+        <w:numPr>
+          <w:ilvl w:val="0"/>
+          <w:numId w:val="1015"/>
+        </w:numPr>
+      </w:pPr>
+      <w:r>
+        <w:t xml:space="preserve">Enter the email address that should receive the weekly report</w:t>
+      </w:r>
+    </w:p>
+    <w:p>
+      <w:pPr>
+        <w:pStyle w:val="Compact"/>
+        <w:numPr>
+          <w:ilvl w:val="0"/>
+          <w:numId w:val="1015"/>
+        </w:numPr>
+      </w:pPr>
+      <w:r>
+        <w:t xml:space="preserve">Click</w:t>
+      </w:r>
+      <w:r>
+        <w:t xml:space="preserve"> </w:t>
+      </w:r>
+      <w:r>
+        <w:rPr>
+          <w:b/>
+          <w:bCs/>
+        </w:rPr>
+        <w:t xml:space="preserve">↓ Download Workflow JSON</w:t>
+      </w:r>
+      <w:r>
+        <w:t xml:space="preserve"> </w:t>
+      </w:r>
+      <w:r>
+        <w:t xml:space="preserve">— a</w:t>
+      </w:r>
+      <w:r>
+        <w:t xml:space="preserve"> </w:t>
+      </w:r>
+      <w:r>
+        <w:rPr>
+          <w:rStyle w:val="VerbatimChar"/>
+        </w:rPr>
+        <w:t xml:space="preserve">.workflow.json</w:t>
+      </w:r>
+      <w:r>
+        <w:t xml:space="preserve"> </w:t>
+      </w:r>
+      <w:r>
+        <w:t xml:space="preserve">file is saved to your downloads</w:t>
+      </w:r>
+    </w:p>
+    <w:p>
+      <w:pPr>
+        <w:pStyle w:val="Compact"/>
+        <w:numPr>
+          <w:ilvl w:val="0"/>
+          <w:numId w:val="1015"/>
+        </w:numPr>
+      </w:pPr>
+      <w:r>
+        <w:t xml:space="preserve">Open the</w:t>
+      </w:r>
+      <w:r>
+        <w:t xml:space="preserve"> </w:t>
+      </w:r>
+      <w:r>
+        <w:rPr>
+          <w:b/>
+          <w:bCs/>
+        </w:rPr>
+        <w:t xml:space="preserve">Workflows</w:t>
+      </w:r>
+      <w:r>
+        <w:t xml:space="preserve"> </w:t>
+      </w:r>
+      <w:r>
+        <w:t xml:space="preserve">app in Dynatrace</w:t>
+      </w:r>
+    </w:p>
+    <w:p>
+      <w:pPr>
+        <w:pStyle w:val="Compact"/>
+        <w:numPr>
+          <w:ilvl w:val="0"/>
+          <w:numId w:val="1015"/>
+        </w:numPr>
+      </w:pPr>
+      <w:r>
+        <w:t xml:space="preserve">Click</w:t>
+      </w:r>
+      <w:r>
+        <w:t xml:space="preserve"> </w:t>
+      </w:r>
+      <w:r>
+        <w:rPr>
+          <w:b/>
+          <w:bCs/>
+        </w:rPr>
+        <w:t xml:space="preserve">Upload</w:t>
+      </w:r>
+      <w:r>
+        <w:t xml:space="preserve"> </w:t>
+      </w:r>
+      <w:r>
+        <w:t xml:space="preserve">(top-right) and select the downloaded file</w:t>
+      </w:r>
+    </w:p>
+    <w:p>
+      <w:pPr>
+        <w:pStyle w:val="Compact"/>
+        <w:numPr>
+          <w:ilvl w:val="0"/>
+          <w:numId w:val="1015"/>
+        </w:numPr>
+      </w:pPr>
+      <w:r>
+        <w:t xml:space="preserve">The workflow activates immediately and will run every Monday at 8:00 AM Eastern</w:t>
+      </w:r>
+    </w:p>
+    <w:bookmarkEnd w:id="56"/>
+    <w:bookmarkStart w:id="57" w:name="notes"/>
+    <w:p>
+      <w:pPr>
+        <w:pStyle w:val="Heading3"/>
+      </w:pPr>
+      <w:r>
+        <w:t xml:space="preserve">Notes</w:t>
+      </w:r>
+    </w:p>
+    <w:p>
+      <w:pPr>
+        <w:pStyle w:val="Compact"/>
+        <w:numPr>
+          <w:ilvl w:val="0"/>
+          <w:numId w:val="1016"/>
+        </w:numPr>
+      </w:pPr>
+      <w:r>
+        <w:t xml:space="preserve">The workflow name is</w:t>
+      </w:r>
+      <w:r>
+        <w:t xml:space="preserve"> </w:t>
+      </w:r>
+      <w:r>
+        <w:rPr>
+          <w:rStyle w:val="VerbatimChar"/>
+        </w:rPr>
+        <w:t xml:space="preserve">NavigatorIQ &lt;Persona&gt; Weekly Report</w:t>
+      </w:r>
+      <w:r>
+        <w:t xml:space="preserve"> </w:t>
+      </w:r>
+      <w:r>
+        <w:t xml:space="preserve">and is created as a private workflow owned by whoever uploads it</w:t>
+      </w:r>
+    </w:p>
+    <w:p>
+      <w:pPr>
+        <w:pStyle w:val="Compact"/>
+        <w:numPr>
+          <w:ilvl w:val="0"/>
+          <w:numId w:val="1016"/>
+        </w:numPr>
+      </w:pPr>
+      <w:r>
+        <w:t xml:space="preserve">Each persona generates its own workflow — you can have separate workflows for Developer, SRE, DBA, etc.</w:t>
+      </w:r>
+    </w:p>
+    <w:p>
+      <w:pPr>
+        <w:pStyle w:val="Compact"/>
+        <w:numPr>
+          <w:ilvl w:val="0"/>
+          <w:numId w:val="1016"/>
+        </w:numPr>
+      </w:pPr>
+      <w:r>
+        <w:t xml:space="preserve">The workflow uses the persona’s currently configured heat metrics at the time you download it; re-download if you change your metric configuration</w:t>
+      </w:r>
+    </w:p>
+    <w:p>
+      <w:pPr>
+        <w:pStyle w:val="Compact"/>
+        <w:numPr>
+          <w:ilvl w:val="0"/>
+          <w:numId w:val="1016"/>
+        </w:numPr>
+      </w:pPr>
+      <w:r>
+        <w:t xml:space="preserve">You need the</w:t>
+      </w:r>
+      <w:r>
+        <w:t xml:space="preserve"> </w:t>
+      </w:r>
+      <w:r>
+        <w:rPr>
+          <w:b/>
+          <w:bCs/>
+        </w:rPr>
+        <w:t xml:space="preserve">Dynatrace Intelligence (Davis Copilot)</w:t>
+      </w:r>
+      <w:r>
+        <w:t xml:space="preserve"> </w:t>
+      </w:r>
+      <w:r>
+        <w:t xml:space="preserve">and</w:t>
+      </w:r>
+      <w:r>
+        <w:t xml:space="preserve"> </w:t>
+      </w:r>
+      <w:r>
+        <w:rPr>
+          <w:b/>
+          <w:bCs/>
+        </w:rPr>
+        <w:t xml:space="preserve">Workflows</w:t>
+      </w:r>
+      <w:r>
+        <w:t xml:space="preserve"> </w:t>
+      </w:r>
+      <w:r>
+        <w:t xml:space="preserve">apps available in your tenant</w:t>
+      </w:r>
+    </w:p>
+    <w:p>
+      <w:r>
+        <w:pict>
+          <v:rect style="width:0;height:1.5pt" o:hralign="center" o:hrstd="t" o:hr="t"/>
+        </w:pict>
+      </w:r>
+    </w:p>
+    <w:bookmarkEnd w:id="57"/>
+    <w:bookmarkEnd w:id="58"/>
+    <w:bookmarkStart w:id="63" w:name="settings-personal"/>
+    <w:p>
+      <w:pPr>
+        <w:pStyle w:val="Heading2"/>
+      </w:pPr>
+      <w:r>
+        <w:t xml:space="preserve">15. Settings — Personal</w:t>
+      </w:r>
+    </w:p>
+    <w:p>
+      <w:pPr>
+        <w:pStyle w:val="FirstParagraph"/>
+      </w:pPr>
+      <w:r>
         <w:t xml:space="preserve">Personal settings are saved to your Dynatrace user state. They are private to you and do not affect other users. Open with the</w:t>
       </w:r>
       <w:r>
@@ -5462,7 +5979,7 @@
         <w:t xml:space="preserve">button in the header.</w:t>
       </w:r>
     </w:p>
-    <w:bookmarkStart w:id="54" w:name="app-links"/>
+    <w:bookmarkStart w:id="59" w:name="app-links"/>
     <w:p>
       <w:pPr>
         <w:pStyle w:val="Heading3"/>
@@ -5591,8 +6108,8 @@
         <w:t xml:space="preserve">— colored dot toggles the app on/off without deleting it</w:t>
       </w:r>
     </w:p>
-    <w:bookmarkEnd w:id="54"/>
-    <w:bookmarkStart w:id="55" w:name="assessment-thresholds"/>
+    <w:bookmarkEnd w:id="59"/>
+    <w:bookmarkStart w:id="60" w:name="assessment-thresholds"/>
     <w:p>
       <w:pPr>
         <w:pStyle w:val="Heading3"/>
@@ -5621,8 +6138,8 @@
         <w:t xml:space="preserve">- Response time thresholds should reflect your users’ actual experience expectations</w:t>
       </w:r>
     </w:p>
-    <w:bookmarkEnd w:id="55"/>
-    <w:bookmarkStart w:id="56" w:name="hotness-metrics"/>
+    <w:bookmarkEnd w:id="60"/>
+    <w:bookmarkStart w:id="61" w:name="hotness-metrics"/>
     <w:p>
       <w:pPr>
         <w:pStyle w:val="Heading3"/>
@@ -5885,8 +6402,8 @@
         <w:t xml:space="preserve">— how values are shown in the UI (ms, %, count, etc.)</w:t>
       </w:r>
     </w:p>
-    <w:bookmarkEnd w:id="56"/>
-    <w:bookmarkStart w:id="57" w:name="general"/>
+    <w:bookmarkEnd w:id="61"/>
+    <w:bookmarkStart w:id="62" w:name="general"/>
     <w:p>
       <w:pPr>
         <w:pStyle w:val="Heading3"/>
@@ -5989,15 +6506,15 @@
         </w:pict>
       </w:r>
     </w:p>
-    <w:bookmarkEnd w:id="57"/>
-    <w:bookmarkEnd w:id="58"/>
-    <w:bookmarkStart w:id="60" w:name="settings-all-users-shared"/>
+    <w:bookmarkEnd w:id="62"/>
+    <w:bookmarkEnd w:id="63"/>
+    <w:bookmarkStart w:id="65" w:name="settings-all-users-shared"/>
     <w:p>
       <w:pPr>
         <w:pStyle w:val="Heading2"/>
       </w:pPr>
       <w:r>
-        <w:t xml:space="preserve">15. Settings — All Users (Shared)</w:t>
+        <w:t xml:space="preserve">16. Settings — All Users (Shared)</w:t>
       </w:r>
     </w:p>
     <w:p>
@@ -6008,7 +6525,7 @@
         <w:t xml:space="preserve">Shared settings are visible to everyone in the tenant. Only configure things here that you want all users to see.</w:t>
       </w:r>
     </w:p>
-    <w:bookmarkStart w:id="59" w:name="custom-personas-1"/>
+    <w:bookmarkStart w:id="64" w:name="custom-personas-1"/>
     <w:p>
       <w:pPr>
         <w:pStyle w:val="Heading3"/>
@@ -6106,15 +6623,15 @@
         </w:pict>
       </w:r>
     </w:p>
-    <w:bookmarkEnd w:id="59"/>
-    <w:bookmarkEnd w:id="60"/>
-    <w:bookmarkStart w:id="65" w:name="custom-dql-metrics"/>
+    <w:bookmarkEnd w:id="64"/>
+    <w:bookmarkEnd w:id="65"/>
+    <w:bookmarkStart w:id="70" w:name="custom-dql-metrics"/>
     <w:p>
       <w:pPr>
         <w:pStyle w:val="Heading2"/>
       </w:pPr>
       <w:r>
-        <w:t xml:space="preserve">16. Custom DQL Metrics</w:t>
+        <w:t xml:space="preserve">17. Custom DQL Metrics</w:t>
       </w:r>
     </w:p>
     <w:p>
@@ -6125,7 +6642,7 @@
         <w:t xml:space="preserve">Custom DQL metrics are the most powerful way to extend NavigatorIQ to any data in your environment.</w:t>
       </w:r>
     </w:p>
-    <w:bookmarkStart w:id="61" w:name="requirements"/>
+    <w:bookmarkStart w:id="66" w:name="requirements"/>
     <w:p>
       <w:pPr>
         <w:pStyle w:val="Heading3"/>
@@ -6198,8 +6715,8 @@
         <w:t xml:space="preserve">| makeTimeseries value=count(), interval:${interval}</w:t>
       </w:r>
     </w:p>
-    <w:bookmarkEnd w:id="61"/>
-    <w:bookmarkStart w:id="62" w:name="available-placeholders"/>
+    <w:bookmarkEnd w:id="66"/>
+    <w:bookmarkStart w:id="67" w:name="available-placeholders"/>
     <w:p>
       <w:pPr>
         <w:pStyle w:val="Heading3"/>
@@ -6506,8 +7023,8 @@
         <w:t xml:space="preserve">placeholders — NavigatorIQ substitutes them with absolute timestamps automatically.</w:t>
       </w:r>
     </w:p>
-    <w:bookmarkEnd w:id="62"/>
-    <w:bookmarkStart w:id="63" w:name="validated-dql-patterns"/>
+    <w:bookmarkEnd w:id="67"/>
+    <w:bookmarkStart w:id="68" w:name="validated-dql-patterns"/>
     <w:p>
       <w:pPr>
         <w:pStyle w:val="Heading3"/>
@@ -6704,8 +7221,8 @@
         <w:t xml:space="preserve">| fieldsAdd value=toDouble(total)</w:t>
       </w:r>
     </w:p>
-    <w:bookmarkEnd w:id="63"/>
-    <w:bookmarkStart w:id="64" w:name="key-field-name-reference"/>
+    <w:bookmarkEnd w:id="68"/>
+    <w:bookmarkStart w:id="69" w:name="key-field-name-reference"/>
     <w:p>
       <w:pPr>
         <w:pStyle w:val="Heading3"/>
@@ -6936,18 +7453,18 @@
         </w:pict>
       </w:r>
     </w:p>
-    <w:bookmarkEnd w:id="64"/>
-    <w:bookmarkEnd w:id="65"/>
-    <w:bookmarkStart w:id="72" w:name="best-practices"/>
+    <w:bookmarkEnd w:id="69"/>
+    <w:bookmarkEnd w:id="70"/>
+    <w:bookmarkStart w:id="77" w:name="best-practices"/>
     <w:p>
       <w:pPr>
         <w:pStyle w:val="Heading2"/>
       </w:pPr>
       <w:r>
-        <w:t xml:space="preserve">17. Best Practices</w:t>
-      </w:r>
-    </w:p>
-    <w:bookmarkStart w:id="66" w:name="timeframe-selection"/>
+        <w:t xml:space="preserve">18. Best Practices</w:t>
+      </w:r>
+    </w:p>
+    <w:bookmarkStart w:id="71" w:name="timeframe-selection"/>
     <w:p>
       <w:pPr>
         <w:pStyle w:val="Heading3"/>
@@ -6961,7 +7478,7 @@
         <w:pStyle w:val="Compact"/>
         <w:numPr>
           <w:ilvl w:val="0"/>
-          <w:numId w:val="1014"/>
+          <w:numId w:val="1017"/>
         </w:numPr>
       </w:pPr>
       <w:r>
@@ -6983,7 +7500,7 @@
         <w:pStyle w:val="Compact"/>
         <w:numPr>
           <w:ilvl w:val="0"/>
-          <w:numId w:val="1014"/>
+          <w:numId w:val="1017"/>
         </w:numPr>
       </w:pPr>
       <w:r>
@@ -7005,7 +7522,7 @@
         <w:pStyle w:val="Compact"/>
         <w:numPr>
           <w:ilvl w:val="0"/>
-          <w:numId w:val="1014"/>
+          <w:numId w:val="1017"/>
         </w:numPr>
       </w:pPr>
       <w:r>
@@ -7022,8 +7539,8 @@
         <w:t xml:space="preserve">side by side (switch tabs) to compare today’s pattern against the prior day. A spike that also happened yesterday at the same time is likely a scheduled job, not an incident.</w:t>
       </w:r>
     </w:p>
-    <w:bookmarkEnd w:id="66"/>
-    <w:bookmarkStart w:id="67" w:name="heat-strip-interpretation"/>
+    <w:bookmarkEnd w:id="71"/>
+    <w:bookmarkStart w:id="72" w:name="heat-strip-interpretation"/>
     <w:p>
       <w:pPr>
         <w:pStyle w:val="Heading3"/>
@@ -7037,7 +7554,7 @@
         <w:pStyle w:val="Compact"/>
         <w:numPr>
           <w:ilvl w:val="0"/>
-          <w:numId w:val="1015"/>
+          <w:numId w:val="1018"/>
         </w:numPr>
       </w:pPr>
       <w:r>
@@ -7049,7 +7566,7 @@
         <w:pStyle w:val="Compact"/>
         <w:numPr>
           <w:ilvl w:val="0"/>
-          <w:numId w:val="1015"/>
+          <w:numId w:val="1018"/>
         </w:numPr>
       </w:pPr>
       <w:r>
@@ -7071,7 +7588,7 @@
         <w:pStyle w:val="Compact"/>
         <w:numPr>
           <w:ilvl w:val="0"/>
-          <w:numId w:val="1015"/>
+          <w:numId w:val="1018"/>
         </w:numPr>
       </w:pPr>
       <w:r>
@@ -7101,8 +7618,8 @@
         <w:t xml:space="preserve">it started and how it correlates with metrics — open the Problems app for full detail.</w:t>
       </w:r>
     </w:p>
-    <w:bookmarkEnd w:id="67"/>
-    <w:bookmarkStart w:id="68" w:name="assessment-thresholds-1"/>
+    <w:bookmarkEnd w:id="72"/>
+    <w:bookmarkStart w:id="73" w:name="assessment-thresholds-1"/>
     <w:p>
       <w:pPr>
         <w:pStyle w:val="Heading3"/>
@@ -7116,7 +7633,7 @@
         <w:pStyle w:val="Compact"/>
         <w:numPr>
           <w:ilvl w:val="0"/>
-          <w:numId w:val="1016"/>
+          <w:numId w:val="1019"/>
         </w:numPr>
       </w:pPr>
       <w:r>
@@ -7128,7 +7645,7 @@
         <w:pStyle w:val="Compact"/>
         <w:numPr>
           <w:ilvl w:val="0"/>
-          <w:numId w:val="1016"/>
+          <w:numId w:val="1019"/>
         </w:numPr>
       </w:pPr>
       <w:r>
@@ -7156,15 +7673,15 @@
         <w:pStyle w:val="Compact"/>
         <w:numPr>
           <w:ilvl w:val="0"/>
-          <w:numId w:val="1016"/>
+          <w:numId w:val="1019"/>
         </w:numPr>
       </w:pPr>
       <w:r>
         <w:t xml:space="preserve">Set thresholds conservatively for critical production environments and more liberally for staging or dev environments — consider creating separate custom personas for each.</w:t>
       </w:r>
     </w:p>
-    <w:bookmarkEnd w:id="68"/>
-    <w:bookmarkStart w:id="69" w:name="hotness-assist-workflow"/>
+    <w:bookmarkEnd w:id="73"/>
+    <w:bookmarkStart w:id="74" w:name="hotness-assist-workflow"/>
     <w:p>
       <w:pPr>
         <w:pStyle w:val="Heading3"/>
@@ -7178,7 +7695,7 @@
         <w:pStyle w:val="Compact"/>
         <w:numPr>
           <w:ilvl w:val="0"/>
-          <w:numId w:val="1017"/>
+          <w:numId w:val="1020"/>
         </w:numPr>
       </w:pPr>
       <w:r>
@@ -7196,7 +7713,7 @@
         <w:pStyle w:val="Compact"/>
         <w:numPr>
           <w:ilvl w:val="0"/>
-          <w:numId w:val="1017"/>
+          <w:numId w:val="1020"/>
         </w:numPr>
       </w:pPr>
       <w:r>
@@ -7224,7 +7741,7 @@
         <w:pStyle w:val="Compact"/>
         <w:numPr>
           <w:ilvl w:val="0"/>
-          <w:numId w:val="1017"/>
+          <w:numId w:val="1020"/>
         </w:numPr>
       </w:pPr>
       <w:r>
@@ -7252,7 +7769,7 @@
         <w:pStyle w:val="Compact"/>
         <w:numPr>
           <w:ilvl w:val="0"/>
-          <w:numId w:val="1017"/>
+          <w:numId w:val="1020"/>
         </w:numPr>
       </w:pPr>
       <w:r>
@@ -7280,7 +7797,7 @@
         <w:pStyle w:val="Compact"/>
         <w:numPr>
           <w:ilvl w:val="0"/>
-          <w:numId w:val="1017"/>
+          <w:numId w:val="1020"/>
         </w:numPr>
       </w:pPr>
       <w:r>
@@ -7308,7 +7825,7 @@
         <w:pStyle w:val="Compact"/>
         <w:numPr>
           <w:ilvl w:val="0"/>
-          <w:numId w:val="1017"/>
+          <w:numId w:val="1020"/>
         </w:numPr>
       </w:pPr>
       <w:r>
@@ -7331,8 +7848,8 @@
         <w:t xml:space="preserve">to launch directly into the right Dynatrace app.</w:t>
       </w:r>
     </w:p>
-    <w:bookmarkEnd w:id="69"/>
-    <w:bookmarkStart w:id="70" w:name="custom-personas-for-teams"/>
+    <w:bookmarkEnd w:id="74"/>
+    <w:bookmarkStart w:id="75" w:name="custom-personas-for-teams"/>
     <w:p>
       <w:pPr>
         <w:pStyle w:val="Heading3"/>
@@ -7349,8 +7866,8 @@
         <w:t xml:space="preserve">If you support multiple teams with different concerns, create a custom persona per team in Settings → All Users. Each team member can then select their team persona as default. Custom personas can cover any Dynatrace metric via DQL — there is no limit to what you can surface.</w:t>
       </w:r>
     </w:p>
-    <w:bookmarkEnd w:id="70"/>
-    <w:bookmarkStart w:id="71" w:name="auto-refresh-for-war-rooms"/>
+    <w:bookmarkEnd w:id="75"/>
+    <w:bookmarkStart w:id="76" w:name="auto-refresh-for-war-rooms"/>
     <w:p>
       <w:pPr>
         <w:pStyle w:val="Heading3"/>
@@ -7374,15 +7891,15 @@
         </w:pict>
       </w:r>
     </w:p>
-    <w:bookmarkEnd w:id="71"/>
-    <w:bookmarkEnd w:id="72"/>
-    <w:bookmarkStart w:id="79" w:name="incident-response-workflow"/>
+    <w:bookmarkEnd w:id="76"/>
+    <w:bookmarkEnd w:id="77"/>
+    <w:bookmarkStart w:id="84" w:name="incident-response-workflow"/>
     <w:p>
       <w:pPr>
         <w:pStyle w:val="Heading2"/>
       </w:pPr>
       <w:r>
-        <w:t xml:space="preserve">18. Incident Response Workflow</w:t>
+        <w:t xml:space="preserve">19. Incident Response Workflow</w:t>
       </w:r>
     </w:p>
     <w:p>
@@ -7393,7 +7910,7 @@
         <w:t xml:space="preserve">This is the recommended flow for using NavigatorIQ during an active incident.</w:t>
       </w:r>
     </w:p>
-    <w:bookmarkStart w:id="73" w:name="step-1-triage-with-the-heat-strip"/>
+    <w:bookmarkStart w:id="78" w:name="step-1-triage-with-the-heat-strip"/>
     <w:p>
       <w:pPr>
         <w:pStyle w:val="Heading3"/>
@@ -7407,7 +7924,7 @@
         <w:pStyle w:val="Compact"/>
         <w:numPr>
           <w:ilvl w:val="0"/>
-          <w:numId w:val="1018"/>
+          <w:numId w:val="1021"/>
         </w:numPr>
       </w:pPr>
       <w:r>
@@ -7429,7 +7946,7 @@
         <w:pStyle w:val="Compact"/>
         <w:numPr>
           <w:ilvl w:val="0"/>
-          <w:numId w:val="1018"/>
+          <w:numId w:val="1021"/>
         </w:numPr>
       </w:pPr>
       <w:r>
@@ -7441,15 +7958,15 @@
         <w:pStyle w:val="Compact"/>
         <w:numPr>
           <w:ilvl w:val="0"/>
-          <w:numId w:val="1018"/>
+          <w:numId w:val="1021"/>
         </w:numPr>
       </w:pPr>
       <w:r>
         <w:t xml:space="preserve">Note whether green (deployment) or red (Davis Problem) markers are present</w:t>
       </w:r>
     </w:p>
-    <w:bookmarkEnd w:id="73"/>
-    <w:bookmarkStart w:id="74" w:name="step-2-identify-the-pattern"/>
+    <w:bookmarkEnd w:id="78"/>
+    <w:bookmarkStart w:id="79" w:name="step-2-identify-the-pattern"/>
     <w:p>
       <w:pPr>
         <w:pStyle w:val="Heading3"/>
@@ -7463,7 +7980,7 @@
         <w:pStyle w:val="Compact"/>
         <w:numPr>
           <w:ilvl w:val="0"/>
-          <w:numId w:val="1019"/>
+          <w:numId w:val="1022"/>
         </w:numPr>
       </w:pPr>
       <w:r>
@@ -7485,7 +8002,7 @@
         <w:pStyle w:val="Compact"/>
         <w:numPr>
           <w:ilvl w:val="0"/>
-          <w:numId w:val="1019"/>
+          <w:numId w:val="1022"/>
         </w:numPr>
       </w:pPr>
       <w:r>
@@ -7513,7 +8030,7 @@
         <w:pStyle w:val="Compact"/>
         <w:numPr>
           <w:ilvl w:val="0"/>
-          <w:numId w:val="1019"/>
+          <w:numId w:val="1022"/>
         </w:numPr>
       </w:pPr>
       <w:r>
@@ -7536,8 +8053,8 @@
         <w:t xml:space="preserve">at the bottom — is there already an open problem? If yes, coordinate with whoever owns it.</w:t>
       </w:r>
     </w:p>
-    <w:bookmarkEnd w:id="74"/>
-    <w:bookmarkStart w:id="75" w:name="step-3-find-the-root-metric"/>
+    <w:bookmarkEnd w:id="79"/>
+    <w:bookmarkStart w:id="80" w:name="step-3-find-the-root-metric"/>
     <w:p>
       <w:pPr>
         <w:pStyle w:val="Heading3"/>
@@ -7551,7 +8068,7 @@
         <w:pStyle w:val="Compact"/>
         <w:numPr>
           <w:ilvl w:val="0"/>
-          <w:numId w:val="1020"/>
+          <w:numId w:val="1023"/>
         </w:numPr>
       </w:pPr>
       <w:r>
@@ -7579,7 +8096,7 @@
         <w:pStyle w:val="Compact"/>
         <w:numPr>
           <w:ilvl w:val="0"/>
-          <w:numId w:val="1020"/>
+          <w:numId w:val="1023"/>
         </w:numPr>
       </w:pPr>
       <w:r>
@@ -7607,7 +8124,7 @@
         <w:pStyle w:val="Compact"/>
         <w:numPr>
           <w:ilvl w:val="0"/>
-          <w:numId w:val="1020"/>
+          <w:numId w:val="1023"/>
         </w:numPr>
       </w:pPr>
       <w:r>
@@ -7635,15 +8152,15 @@
         <w:pStyle w:val="Compact"/>
         <w:numPr>
           <w:ilvl w:val="0"/>
-          <w:numId w:val="1020"/>
+          <w:numId w:val="1023"/>
         </w:numPr>
       </w:pPr>
       <w:r>
         <w:t xml:space="preserve">The metric with the highest Z-score and the strongest correlations is your primary suspect.</w:t>
       </w:r>
     </w:p>
-    <w:bookmarkEnd w:id="75"/>
-    <w:bookmarkStart w:id="76" w:name="step-4-drill-down"/>
+    <w:bookmarkEnd w:id="80"/>
+    <w:bookmarkStart w:id="81" w:name="step-4-drill-down"/>
     <w:p>
       <w:pPr>
         <w:pStyle w:val="Heading3"/>
@@ -7657,7 +8174,7 @@
         <w:pStyle w:val="Compact"/>
         <w:numPr>
           <w:ilvl w:val="0"/>
-          <w:numId w:val="1021"/>
+          <w:numId w:val="1024"/>
         </w:numPr>
       </w:pPr>
       <w:r>
@@ -7685,7 +8202,7 @@
         <w:pStyle w:val="Compact"/>
         <w:numPr>
           <w:ilvl w:val="0"/>
-          <w:numId w:val="1021"/>
+          <w:numId w:val="1024"/>
         </w:numPr>
       </w:pPr>
       <w:r>
@@ -7697,7 +8214,7 @@
         <w:pStyle w:val="Compact"/>
         <w:numPr>
           <w:ilvl w:val="0"/>
-          <w:numId w:val="1021"/>
+          <w:numId w:val="1024"/>
         </w:numPr>
       </w:pPr>
       <w:r>
@@ -7709,7 +8226,7 @@
         <w:pStyle w:val="Compact"/>
         <w:numPr>
           <w:ilvl w:val="0"/>
-          <w:numId w:val="1021"/>
+          <w:numId w:val="1024"/>
         </w:numPr>
       </w:pPr>
       <w:r>
@@ -7732,8 +8249,8 @@
         <w:t xml:space="preserve">button to open the full Dynatrace app at the right scope</w:t>
       </w:r>
     </w:p>
-    <w:bookmarkEnd w:id="76"/>
-    <w:bookmarkStart w:id="77" w:name="step-5-validate-the-fix"/>
+    <w:bookmarkEnd w:id="81"/>
+    <w:bookmarkStart w:id="82" w:name="step-5-validate-the-fix"/>
     <w:p>
       <w:pPr>
         <w:pStyle w:val="Heading3"/>
@@ -7747,7 +8264,7 @@
         <w:pStyle w:val="Compact"/>
         <w:numPr>
           <w:ilvl w:val="0"/>
-          <w:numId w:val="1022"/>
+          <w:numId w:val="1025"/>
         </w:numPr>
       </w:pPr>
       <w:r>
@@ -7759,7 +8276,7 @@
         <w:pStyle w:val="Compact"/>
         <w:numPr>
           <w:ilvl w:val="0"/>
-          <w:numId w:val="1022"/>
+          <w:numId w:val="1025"/>
         </w:numPr>
       </w:pPr>
       <w:r>
@@ -7787,7 +8304,7 @@
         <w:pStyle w:val="Compact"/>
         <w:numPr>
           <w:ilvl w:val="0"/>
-          <w:numId w:val="1022"/>
+          <w:numId w:val="1025"/>
         </w:numPr>
       </w:pPr>
       <w:r>
@@ -7799,15 +8316,15 @@
         <w:pStyle w:val="Compact"/>
         <w:numPr>
           <w:ilvl w:val="0"/>
-          <w:numId w:val="1022"/>
+          <w:numId w:val="1025"/>
         </w:numPr>
       </w:pPr>
       <w:r>
         <w:t xml:space="preserve">If a deployment caused the incident, verify the new green dot appears and subsequent bars cool down</w:t>
       </w:r>
     </w:p>
-    <w:bookmarkEnd w:id="77"/>
-    <w:bookmarkStart w:id="78" w:name="step-6-post-incident-review"/>
+    <w:bookmarkEnd w:id="82"/>
+    <w:bookmarkStart w:id="83" w:name="step-6-post-incident-review"/>
     <w:p>
       <w:pPr>
         <w:pStyle w:val="Heading3"/>
@@ -7821,7 +8338,7 @@
         <w:pStyle w:val="Compact"/>
         <w:numPr>
           <w:ilvl w:val="0"/>
-          <w:numId w:val="1023"/>
+          <w:numId w:val="1026"/>
         </w:numPr>
       </w:pPr>
       <w:r>
@@ -7849,7 +8366,7 @@
         <w:pStyle w:val="Compact"/>
         <w:numPr>
           <w:ilvl w:val="0"/>
-          <w:numId w:val="1023"/>
+          <w:numId w:val="1026"/>
         </w:numPr>
       </w:pPr>
       <w:r>
@@ -7877,7 +8394,7 @@
         <w:pStyle w:val="Compact"/>
         <w:numPr>
           <w:ilvl w:val="0"/>
-          <w:numId w:val="1023"/>
+          <w:numId w:val="1026"/>
         </w:numPr>
       </w:pPr>
       <w:r>
@@ -7891,18 +8408,18 @@
         </w:pict>
       </w:r>
     </w:p>
-    <w:bookmarkEnd w:id="78"/>
-    <w:bookmarkEnd w:id="79"/>
-    <w:bookmarkStart w:id="86" w:name="troubleshooting"/>
+    <w:bookmarkEnd w:id="83"/>
+    <w:bookmarkEnd w:id="84"/>
+    <w:bookmarkStart w:id="91" w:name="troubleshooting"/>
     <w:p>
       <w:pPr>
         <w:pStyle w:val="Heading2"/>
       </w:pPr>
       <w:r>
-        <w:t xml:space="preserve">19. Troubleshooting</w:t>
-      </w:r>
-    </w:p>
-    <w:bookmarkStart w:id="80" w:name="the-app-shows-no-data-for-all-metrics"/>
+        <w:t xml:space="preserve">20. Troubleshooting</w:t>
+      </w:r>
+    </w:p>
+    <w:bookmarkStart w:id="85" w:name="the-app-shows-no-data-for-all-metrics"/>
     <w:p>
       <w:pPr>
         <w:pStyle w:val="Heading3"/>
@@ -7928,7 +8445,7 @@
         <w:pStyle w:val="Compact"/>
         <w:numPr>
           <w:ilvl w:val="0"/>
-          <w:numId w:val="1024"/>
+          <w:numId w:val="1027"/>
         </w:numPr>
       </w:pPr>
       <w:r>
@@ -7940,7 +8457,7 @@
         <w:pStyle w:val="Compact"/>
         <w:numPr>
           <w:ilvl w:val="0"/>
-          <w:numId w:val="1024"/>
+          <w:numId w:val="1027"/>
         </w:numPr>
       </w:pPr>
       <w:r>
@@ -7952,15 +8469,15 @@
         <w:pStyle w:val="Compact"/>
         <w:numPr>
           <w:ilvl w:val="0"/>
-          <w:numId w:val="1024"/>
+          <w:numId w:val="1027"/>
         </w:numPr>
       </w:pPr>
       <w:r>
         <w:t xml:space="preserve">For custom DQL metrics, test the query directly in the Dynatrace DQL editor to confirm it returns results</w:t>
       </w:r>
     </w:p>
-    <w:bookmarkEnd w:id="80"/>
-    <w:bookmarkStart w:id="81" w:name="Xd75ca970f28b40a84d2cc194e0390fdb7daf97a"/>
+    <w:bookmarkEnd w:id="85"/>
+    <w:bookmarkStart w:id="86" w:name="Xd75ca970f28b40a84d2cc194e0390fdb7daf97a"/>
     <w:p>
       <w:pPr>
         <w:pStyle w:val="Heading3"/>
@@ -7974,7 +8491,7 @@
         <w:pStyle w:val="Compact"/>
         <w:numPr>
           <w:ilvl w:val="0"/>
-          <w:numId w:val="1025"/>
+          <w:numId w:val="1028"/>
         </w:numPr>
       </w:pPr>
       <w:r>
@@ -8002,7 +8519,7 @@
         <w:pStyle w:val="Compact"/>
         <w:numPr>
           <w:ilvl w:val="0"/>
-          <w:numId w:val="1025"/>
+          <w:numId w:val="1028"/>
         </w:numPr>
       </w:pPr>
       <w:r>
@@ -8030,7 +8547,7 @@
         <w:pStyle w:val="Compact"/>
         <w:numPr>
           <w:ilvl w:val="0"/>
-          <w:numId w:val="1025"/>
+          <w:numId w:val="1028"/>
         </w:numPr>
       </w:pPr>
       <w:r>
@@ -8065,8 +8582,8 @@
         <w:t xml:space="preserve">relative to each other. Switch to Last 7 Days to get a broader baseline.</w:t>
       </w:r>
     </w:p>
-    <w:bookmarkEnd w:id="81"/>
-    <w:bookmarkStart w:id="82" w:name="davis-problem-markers-are-not-appearing"/>
+    <w:bookmarkEnd w:id="86"/>
+    <w:bookmarkStart w:id="87" w:name="davis-problem-markers-are-not-appearing"/>
     <w:p>
       <w:pPr>
         <w:pStyle w:val="Heading3"/>
@@ -8080,7 +8597,7 @@
         <w:pStyle w:val="Compact"/>
         <w:numPr>
           <w:ilvl w:val="0"/>
-          <w:numId w:val="1026"/>
+          <w:numId w:val="1029"/>
         </w:numPr>
       </w:pPr>
       <w:r>
@@ -8119,7 +8636,7 @@
         <w:pStyle w:val="Compact"/>
         <w:numPr>
           <w:ilvl w:val="0"/>
-          <w:numId w:val="1026"/>
+          <w:numId w:val="1029"/>
         </w:numPr>
       </w:pPr>
       <w:r>
@@ -8147,15 +8664,15 @@
         <w:pStyle w:val="Compact"/>
         <w:numPr>
           <w:ilvl w:val="0"/>
-          <w:numId w:val="1026"/>
+          <w:numId w:val="1029"/>
         </w:numPr>
       </w:pPr>
       <w:r>
         <w:t xml:space="preserve">In dense views (Today / 7d), markers appear as size-scaled red dots rather than numbers. A dot is still shown even when small.</w:t>
       </w:r>
     </w:p>
-    <w:bookmarkEnd w:id="82"/>
-    <w:bookmarkStart w:id="83" w:name="X74e2d5471904cc0306351fc45e5911cee792d9c"/>
+    <w:bookmarkEnd w:id="87"/>
+    <w:bookmarkStart w:id="88" w:name="X74e2d5471904cc0306351fc45e5911cee792d9c"/>
     <w:p>
       <w:pPr>
         <w:pStyle w:val="Heading3"/>
@@ -8181,7 +8698,7 @@
         <w:pStyle w:val="Compact"/>
         <w:numPr>
           <w:ilvl w:val="0"/>
-          <w:numId w:val="1027"/>
+          <w:numId w:val="1030"/>
         </w:numPr>
       </w:pPr>
       <w:r>
@@ -8209,7 +8726,7 @@
         <w:pStyle w:val="Compact"/>
         <w:numPr>
           <w:ilvl w:val="0"/>
-          <w:numId w:val="1027"/>
+          <w:numId w:val="1030"/>
         </w:numPr>
       </w:pPr>
       <w:r>
@@ -8221,15 +8738,15 @@
         <w:pStyle w:val="Compact"/>
         <w:numPr>
           <w:ilvl w:val="0"/>
-          <w:numId w:val="1027"/>
+          <w:numId w:val="1030"/>
         </w:numPr>
       </w:pPr>
       <w:r>
         <w:t xml:space="preserve">If you are a first-time user and see this immediately: ensure you have been granted access to the NavigatorIQ app in the Dynatrace tenant</w:t>
       </w:r>
     </w:p>
-    <w:bookmarkEnd w:id="83"/>
-    <w:bookmarkStart w:id="84" w:name="the-app-is-very-slow-to-load"/>
+    <w:bookmarkEnd w:id="88"/>
+    <w:bookmarkStart w:id="89" w:name="the-app-is-very-slow-to-load"/>
     <w:p>
       <w:pPr>
         <w:pStyle w:val="Heading3"/>
@@ -8243,7 +8760,7 @@
         <w:pStyle w:val="Compact"/>
         <w:numPr>
           <w:ilvl w:val="0"/>
-          <w:numId w:val="1028"/>
+          <w:numId w:val="1031"/>
         </w:numPr>
       </w:pPr>
       <w:r>
@@ -8255,7 +8772,7 @@
         <w:pStyle w:val="Compact"/>
         <w:numPr>
           <w:ilvl w:val="0"/>
-          <w:numId w:val="1028"/>
+          <w:numId w:val="1031"/>
         </w:numPr>
       </w:pPr>
       <w:r>
@@ -8267,15 +8784,15 @@
         <w:pStyle w:val="Compact"/>
         <w:numPr>
           <w:ilvl w:val="0"/>
-          <w:numId w:val="1028"/>
+          <w:numId w:val="1031"/>
         </w:numPr>
       </w:pPr>
       <w:r>
         <w:t xml:space="preserve">Auto-refresh at a very short interval (e.g., 60 seconds) with many metrics can cause continuous loading. Use 300000ms (5 min) or longer.</w:t>
       </w:r>
     </w:p>
-    <w:bookmarkEnd w:id="84"/>
-    <w:bookmarkStart w:id="85" w:name="my-settings-were-lost"/>
+    <w:bookmarkEnd w:id="89"/>
+    <w:bookmarkStart w:id="90" w:name="my-settings-were-lost"/>
     <w:p>
       <w:pPr>
         <w:pStyle w:val="Heading3"/>
@@ -8289,7 +8806,7 @@
         <w:pStyle w:val="Compact"/>
         <w:numPr>
           <w:ilvl w:val="0"/>
-          <w:numId w:val="1029"/>
+          <w:numId w:val="1032"/>
         </w:numPr>
       </w:pPr>
       <w:r>
@@ -8301,7 +8818,7 @@
         <w:pStyle w:val="Compact"/>
         <w:numPr>
           <w:ilvl w:val="0"/>
-          <w:numId w:val="1029"/>
+          <w:numId w:val="1032"/>
         </w:numPr>
       </w:pPr>
       <w:r>
@@ -8315,9 +8832,9 @@
         </w:pict>
       </w:r>
     </w:p>
-    <w:bookmarkEnd w:id="85"/>
-    <w:bookmarkEnd w:id="86"/>
-    <w:bookmarkStart w:id="88" w:name="appendix-personas-quick-reference"/>
+    <w:bookmarkEnd w:id="90"/>
+    <w:bookmarkEnd w:id="91"/>
+    <w:bookmarkStart w:id="93" w:name="appendix-personas-quick-reference"/>
     <w:p>
       <w:pPr>
         <w:pStyle w:val="Heading2"/>
@@ -8682,7 +9199,7 @@
         </w:rPr>
         <w:t xml:space="preserve"> </w:t>
       </w:r>
-      <w:hyperlink r:id="rId87">
+      <w:hyperlink r:id="rId92">
         <w:r>
           <w:rPr>
             <w:rStyle w:val="Hyperlink"/>
@@ -8700,8 +9217,8 @@
         <w:t xml:space="preserve">.</w:t>
       </w:r>
     </w:p>
-    <w:bookmarkEnd w:id="88"/>
-    <w:bookmarkEnd w:id="89"/>
+    <w:bookmarkEnd w:id="93"/>
+    <w:bookmarkEnd w:id="94"/>
     <w:sectPr>
       <w:footnotePr>
         <w:numRestart w:val="eachSect"/>
@@ -9522,15 +10039,6 @@
     <w:abstractNumId w:val="991"/>
   </w:num>
   <w:num w:numId="1014">
-    <w:abstractNumId w:val="991"/>
-  </w:num>
-  <w:num w:numId="1015">
-    <w:abstractNumId w:val="991"/>
-  </w:num>
-  <w:num w:numId="1016">
-    <w:abstractNumId w:val="991"/>
-  </w:num>
-  <w:num w:numId="1017">
     <w:abstractNumId w:val="99411"/>
     <w:lvlOverride w:ilvl="0">
       <w:startOverride w:val="1"/>
@@ -9560,7 +10068,7 @@
       <w:startOverride w:val="1"/>
     </w:lvlOverride>
   </w:num>
-  <w:num w:numId="1018">
+  <w:num w:numId="1015">
     <w:abstractNumId w:val="99411"/>
     <w:lvlOverride w:ilvl="0">
       <w:startOverride w:val="1"/>
@@ -9590,7 +10098,79 @@
       <w:startOverride w:val="1"/>
     </w:lvlOverride>
   </w:num>
+  <w:num w:numId="1016">
+    <w:abstractNumId w:val="991"/>
+  </w:num>
+  <w:num w:numId="1017">
+    <w:abstractNumId w:val="991"/>
+  </w:num>
+  <w:num w:numId="1018">
+    <w:abstractNumId w:val="991"/>
+  </w:num>
   <w:num w:numId="1019">
+    <w:abstractNumId w:val="991"/>
+  </w:num>
+  <w:num w:numId="1020">
+    <w:abstractNumId w:val="99411"/>
+    <w:lvlOverride w:ilvl="0">
+      <w:startOverride w:val="1"/>
+    </w:lvlOverride>
+    <w:lvlOverride w:ilvl="1">
+      <w:startOverride w:val="1"/>
+    </w:lvlOverride>
+    <w:lvlOverride w:ilvl="2">
+      <w:startOverride w:val="1"/>
+    </w:lvlOverride>
+    <w:lvlOverride w:ilvl="3">
+      <w:startOverride w:val="1"/>
+    </w:lvlOverride>
+    <w:lvlOverride w:ilvl="4">
+      <w:startOverride w:val="1"/>
+    </w:lvlOverride>
+    <w:lvlOverride w:ilvl="5">
+      <w:startOverride w:val="1"/>
+    </w:lvlOverride>
+    <w:lvlOverride w:ilvl="6">
+      <w:startOverride w:val="1"/>
+    </w:lvlOverride>
+    <w:lvlOverride w:ilvl="7">
+      <w:startOverride w:val="1"/>
+    </w:lvlOverride>
+    <w:lvlOverride w:ilvl="8">
+      <w:startOverride w:val="1"/>
+    </w:lvlOverride>
+  </w:num>
+  <w:num w:numId="1021">
+    <w:abstractNumId w:val="99411"/>
+    <w:lvlOverride w:ilvl="0">
+      <w:startOverride w:val="1"/>
+    </w:lvlOverride>
+    <w:lvlOverride w:ilvl="1">
+      <w:startOverride w:val="1"/>
+    </w:lvlOverride>
+    <w:lvlOverride w:ilvl="2">
+      <w:startOverride w:val="1"/>
+    </w:lvlOverride>
+    <w:lvlOverride w:ilvl="3">
+      <w:startOverride w:val="1"/>
+    </w:lvlOverride>
+    <w:lvlOverride w:ilvl="4">
+      <w:startOverride w:val="1"/>
+    </w:lvlOverride>
+    <w:lvlOverride w:ilvl="5">
+      <w:startOverride w:val="1"/>
+    </w:lvlOverride>
+    <w:lvlOverride w:ilvl="6">
+      <w:startOverride w:val="1"/>
+    </w:lvlOverride>
+    <w:lvlOverride w:ilvl="7">
+      <w:startOverride w:val="1"/>
+    </w:lvlOverride>
+    <w:lvlOverride w:ilvl="8">
+      <w:startOverride w:val="1"/>
+    </w:lvlOverride>
+  </w:num>
+  <w:num w:numId="1022">
     <w:abstractNumId w:val="99414"/>
     <w:lvlOverride w:ilvl="0">
       <w:startOverride w:val="4"/>
@@ -9620,7 +10200,7 @@
       <w:startOverride w:val="4"/>
     </w:lvlOverride>
   </w:num>
-  <w:num w:numId="1020">
+  <w:num w:numId="1023">
     <w:abstractNumId w:val="99417"/>
     <w:lvlOverride w:ilvl="0">
       <w:startOverride w:val="7"/>
@@ -9650,7 +10230,7 @@
       <w:startOverride w:val="7"/>
     </w:lvlOverride>
   </w:num>
-  <w:num w:numId="1021">
+  <w:num w:numId="1024">
     <w:abstractNumId w:val="994111"/>
     <w:lvlOverride w:ilvl="0">
       <w:startOverride w:val="11"/>
@@ -9680,7 +10260,7 @@
       <w:startOverride w:val="11"/>
     </w:lvlOverride>
   </w:num>
-  <w:num w:numId="1022">
+  <w:num w:numId="1025">
     <w:abstractNumId w:val="994115"/>
     <w:lvlOverride w:ilvl="0">
       <w:startOverride w:val="15"/>
@@ -9710,7 +10290,7 @@
       <w:startOverride w:val="15"/>
     </w:lvlOverride>
   </w:num>
-  <w:num w:numId="1023">
+  <w:num w:numId="1026">
     <w:abstractNumId w:val="994119"/>
     <w:lvlOverride w:ilvl="0">
       <w:startOverride w:val="19"/>
@@ -9740,15 +10320,6 @@
       <w:startOverride w:val="19"/>
     </w:lvlOverride>
   </w:num>
-  <w:num w:numId="1024">
-    <w:abstractNumId w:val="991"/>
-  </w:num>
-  <w:num w:numId="1025">
-    <w:abstractNumId w:val="991"/>
-  </w:num>
-  <w:num w:numId="1026">
-    <w:abstractNumId w:val="991"/>
-  </w:num>
   <w:num w:numId="1027">
     <w:abstractNumId w:val="991"/>
   </w:num>
@@ -9756,6 +10327,15 @@
     <w:abstractNumId w:val="991"/>
   </w:num>
   <w:num w:numId="1029">
+    <w:abstractNumId w:val="991"/>
+  </w:num>
+  <w:num w:numId="1030">
+    <w:abstractNumId w:val="991"/>
+  </w:num>
+  <w:num w:numId="1031">
+    <w:abstractNumId w:val="991"/>
+  </w:num>
+  <w:num w:numId="1032">
     <w:abstractNumId w:val="991"/>
   </w:num>
 </w:numbering>

</xml_diff>